<commit_message>
feat(alpha): Paso 10 y 11 terminados, vista estudiante lista para probar
</commit_message>
<xml_diff>
--- a/Contexto del progreso.docx
+++ b/Contexto del progreso.docx
@@ -378,8 +378,14 @@
           <w:ilvl w:val="0"/>
           <w:numId w:val="7"/>
         </w:numPr>
-      </w:pPr>
-      <w:r>
+        <w:rPr>
+          <w:lang w:val="en-US"/>
+        </w:rPr>
+      </w:pPr>
+      <w:r>
+        <w:rPr>
+          <w:lang w:val="en-US"/>
+        </w:rPr>
         <w:t>[X] Creamos el layout activity_main.xml (con RecyclerView, SwipeRefreshLayout, ProgressBar).</w:t>
       </w:r>
     </w:p>
@@ -702,8 +708,14 @@
           <w:ilvl w:val="0"/>
           <w:numId w:val="11"/>
         </w:numPr>
-      </w:pPr>
-      <w:r>
+        <w:rPr>
+          <w:lang w:val="en-US"/>
+        </w:rPr>
+      </w:pPr>
+      <w:r>
+        <w:rPr>
+          <w:lang w:val="en-US"/>
+        </w:rPr>
         <w:t>[X] Creamos el layout activity_perfil_estudiante.xml (con NestedScrollView, ImageView, RecyclerView horizontal).</w:t>
       </w:r>
     </w:p>
@@ -741,51 +753,368 @@
         <w:t>[X] Creamos la lógica PerfilEstudianteActivity.java (llamando a getMiPerfil y "pintando" todos los datos del perfil, incluyendo la lista de habilidades).</w:t>
       </w:r>
     </w:p>
-    <w:p>
-      <w:r>
-        <w:pict w14:anchorId="53C4D937">
-          <v:rect id="_x0000_i1031" style="width:0;height:1.5pt" o:hralign="center" o:hrstd="t" o:hr="t" fillcolor="#a0a0a0" stroked="f"/>
-        </w:pict>
-      </w:r>
-    </w:p>
-    <w:p>
-      <w:r>
-        <w:t xml:space="preserve">¡Eso es todo lo que hemos hecho! El flujo completo de usuario, desde el registro hasta la postulación y la visualización del perfil, está construido y (lo más importante) </w:t>
-      </w:r>
+    <w:p/>
+    <w:p>
       <w:r>
         <w:rPr>
           <w:b/>
           <w:bCs/>
         </w:rPr>
-        <w:t>sincronizado</w:t>
-      </w:r>
-      <w:r>
-        <w:t>.</w:t>
-      </w:r>
-    </w:p>
-    <w:p>
-      <w:r>
-        <w:t xml:space="preserve">Cuando estés listo, dime </w:t>
+        <w:t>Parte 10: Editar el Perfil de Estudiante</w:t>
+      </w:r>
+      <w:r>
+        <w:t xml:space="preserve"> </w:t>
+      </w:r>
+    </w:p>
+    <w:p>
+      <w:pPr>
+        <w:pStyle w:val="Prrafodelista"/>
+        <w:numPr>
+          <w:ilvl w:val="0"/>
+          <w:numId w:val="13"/>
+        </w:numPr>
+      </w:pPr>
+      <w:r>
+        <w:t xml:space="preserve">[X] Creamos el layout activity_editar_perfil.xml (un formulario con TextInputLayouts para carrera, año, portafolio y descripción). </w:t>
+      </w:r>
+    </w:p>
+    <w:p>
+      <w:pPr>
+        <w:pStyle w:val="Prrafodelista"/>
+      </w:pPr>
+    </w:p>
+    <w:p>
+      <w:pPr>
+        <w:pStyle w:val="Prrafodelista"/>
+        <w:numPr>
+          <w:ilvl w:val="0"/>
+          <w:numId w:val="13"/>
+        </w:numPr>
+      </w:pPr>
+      <w:r>
+        <w:t xml:space="preserve">[X] Actualizamos el POJO PerfilEstudiante.java (y sus dependencias) para que implemente Serializable, permitiendo pasarlo en un Intent. </w:t>
+      </w:r>
+    </w:p>
+    <w:p>
+      <w:pPr>
+        <w:pStyle w:val="Prrafodelista"/>
+      </w:pPr>
+    </w:p>
+    <w:p>
+      <w:pPr>
+        <w:pStyle w:val="Prrafodelista"/>
+        <w:numPr>
+          <w:ilvl w:val="0"/>
+          <w:numId w:val="13"/>
+        </w:numPr>
+      </w:pPr>
+      <w:r>
+        <w:t xml:space="preserve">[X] Creamos la lógica EditarPerfilActivity.java (recibiendo el objeto PerfilEstudiante del Intent y pintando los datos en el formulario). </w:t>
+      </w:r>
+    </w:p>
+    <w:p>
+      <w:pPr>
+        <w:pStyle w:val="Prrafodelista"/>
+      </w:pPr>
+    </w:p>
+    <w:p>
+      <w:pPr>
+        <w:pStyle w:val="Prrafodelista"/>
+        <w:numPr>
+          <w:ilvl w:val="0"/>
+          <w:numId w:val="13"/>
+        </w:numPr>
+      </w:pPr>
+      <w:r>
+        <w:t>[X] Actualizamos PerfilEstudianteActivity.java para que el btnEditarPerfil cree un Intent y envíe el objeto perfilActual como "extra".</w:t>
+      </w:r>
+    </w:p>
+    <w:p>
+      <w:pPr>
+        <w:pStyle w:val="Prrafodelista"/>
+      </w:pPr>
+    </w:p>
+    <w:p>
+      <w:pPr>
+        <w:pStyle w:val="Prrafodelista"/>
+        <w:numPr>
+          <w:ilvl w:val="0"/>
+          <w:numId w:val="13"/>
+        </w:numPr>
+      </w:pPr>
+      <w:r>
+        <w:t xml:space="preserve">[X] Actualizamos ApiService.java (añadimos el endpoint @PUT actualizarMiPerfil(token, perfil)). </w:t>
+      </w:r>
+    </w:p>
+    <w:p>
+      <w:pPr>
+        <w:pStyle w:val="Prrafodelista"/>
+      </w:pPr>
+    </w:p>
+    <w:p>
+      <w:pPr>
+        <w:pStyle w:val="Prrafodelista"/>
+        <w:numPr>
+          <w:ilvl w:val="0"/>
+          <w:numId w:val="13"/>
+        </w:numPr>
+      </w:pPr>
+      <w:r>
+        <w:t xml:space="preserve">[X] Implementamos la lógica de guardarCambios() en EditarPerfilActivity (validar, actualizar el POJO, llamar a la API y finish() al éxito). </w:t>
+      </w:r>
+    </w:p>
+    <w:p>
+      <w:pPr>
+        <w:pStyle w:val="Prrafodelista"/>
+      </w:pPr>
+    </w:p>
+    <w:p>
+      <w:pPr>
+        <w:pStyle w:val="Prrafodelista"/>
+        <w:numPr>
+          <w:ilvl w:val="0"/>
+          <w:numId w:val="13"/>
+        </w:numPr>
+      </w:pPr>
+      <w:r>
+        <w:t xml:space="preserve">[X] Implementamos la </w:t>
       </w:r>
       <w:r>
         <w:rPr>
           <w:b/>
           <w:bCs/>
         </w:rPr>
-        <w:t>"sigue"</w:t>
-      </w:r>
-      <w:r>
-        <w:t xml:space="preserve"> para pasar a la </w:t>
-      </w:r>
+        <w:t>Sincronización de Datos</w:t>
+      </w:r>
+      <w:r>
+        <w:t xml:space="preserve"> con ActivityResultLauncher: </w:t>
+      </w:r>
+    </w:p>
+    <w:p>
+      <w:pPr>
+        <w:pStyle w:val="Prrafodelista"/>
+      </w:pPr>
+    </w:p>
+    <w:p>
+      <w:pPr>
+        <w:pStyle w:val="Prrafodelista"/>
+        <w:numPr>
+          <w:ilvl w:val="0"/>
+          <w:numId w:val="13"/>
+        </w:numPr>
+      </w:pPr>
+      <w:r>
+        <w:t xml:space="preserve">[X] Modificamos EditarPerfilActivity para que llame a setResult(RESULT_OK) antes de finish(). </w:t>
+      </w:r>
+    </w:p>
+    <w:p>
+      <w:pPr>
+        <w:pStyle w:val="Prrafodelista"/>
+      </w:pPr>
+    </w:p>
+    <w:p>
+      <w:pPr>
+        <w:pStyle w:val="Prrafodelista"/>
+        <w:numPr>
+          <w:ilvl w:val="0"/>
+          <w:numId w:val="13"/>
+        </w:numPr>
+      </w:pPr>
+      <w:r>
+        <w:t>[X] Modificamos PerfilEstudianteActivity para usar registerForActivityResult para lanzar la pantalla de edición y, al recibir RESULT_OK, volver a llamar a cargarDatosPerfil() para refrescar los datos.</w:t>
+      </w:r>
+    </w:p>
+    <w:p>
       <w:r>
         <w:rPr>
           <w:b/>
           <w:bCs/>
         </w:rPr>
-        <w:t>Parte 10</w:t>
-      </w:r>
-      <w:r>
-        <w:t xml:space="preserve"> (Editar el Perfil).</w:t>
+        <w:t>Parte 11: Pantalla "Mis Postulaciones"</w:t>
+      </w:r>
+      <w:r>
+        <w:t xml:space="preserve"> </w:t>
+      </w:r>
+    </w:p>
+    <w:p>
+      <w:pPr>
+        <w:pStyle w:val="Prrafodelista"/>
+        <w:numPr>
+          <w:ilvl w:val="0"/>
+          <w:numId w:val="12"/>
+        </w:numPr>
+      </w:pPr>
+      <w:r>
+        <w:t xml:space="preserve">[X] Actualizamos ApiService.java (añadimos el endpoint @GET getMisPostulaciones(token)). </w:t>
+      </w:r>
+    </w:p>
+    <w:p>
+      <w:pPr>
+        <w:pStyle w:val="Prrafodelista"/>
+      </w:pPr>
+    </w:p>
+    <w:p>
+      <w:pPr>
+        <w:pStyle w:val="Prrafodelista"/>
+        <w:numPr>
+          <w:ilvl w:val="0"/>
+          <w:numId w:val="12"/>
+        </w:numPr>
+      </w:pPr>
+      <w:r>
+        <w:lastRenderedPageBreak/>
+        <w:t xml:space="preserve">[X] Creamos el layout item_postulacion.xml (la tarjeta para cada postulación, mostrando título, monto y estado). </w:t>
+      </w:r>
+    </w:p>
+    <w:p>
+      <w:pPr>
+        <w:pStyle w:val="Prrafodelista"/>
+      </w:pPr>
+    </w:p>
+    <w:p>
+      <w:pPr>
+        <w:pStyle w:val="Prrafodelista"/>
+        <w:numPr>
+          <w:ilvl w:val="0"/>
+          <w:numId w:val="12"/>
+        </w:numPr>
+      </w:pPr>
+      <w:r>
+        <w:t xml:space="preserve">[X] Creamos el layout activity_mis_postulaciones.xml (con Toolbar, RecyclerView, ProgressBar y un TextView para emptyState). </w:t>
+      </w:r>
+    </w:p>
+    <w:p>
+      <w:pPr>
+        <w:pStyle w:val="Prrafodelista"/>
+      </w:pPr>
+    </w:p>
+    <w:p>
+      <w:pPr>
+        <w:pStyle w:val="Prrafodelista"/>
+        <w:numPr>
+          <w:ilvl w:val="0"/>
+          <w:numId w:val="12"/>
+        </w:numPr>
+      </w:pPr>
+      <w:r>
+        <w:t xml:space="preserve">[X] Creamos el PostulacionAdapter.java (con ViewHolder, formateo de moneda y lógica de colores para el estado 'pendiente', 'aceptada', 'rechazada'). </w:t>
+      </w:r>
+    </w:p>
+    <w:p>
+      <w:pPr>
+        <w:pStyle w:val="Prrafodelista"/>
+      </w:pPr>
+    </w:p>
+    <w:p>
+      <w:pPr>
+        <w:pStyle w:val="Prrafodelista"/>
+        <w:numPr>
+          <w:ilvl w:val="0"/>
+          <w:numId w:val="12"/>
+        </w:numPr>
+      </w:pPr>
+      <w:r>
+        <w:t xml:space="preserve">[X] Corregimos el POJO Postulacion.java para que acepte un objeto Proyecto anidado (añadiendo el campo private Proyecto proyecto; y su getProyecto()). </w:t>
+      </w:r>
+    </w:p>
+    <w:p>
+      <w:pPr>
+        <w:pStyle w:val="Prrafodelista"/>
+      </w:pPr>
+    </w:p>
+    <w:p>
+      <w:pPr>
+        <w:pStyle w:val="Prrafodelista"/>
+        <w:numPr>
+          <w:ilvl w:val="0"/>
+          <w:numId w:val="12"/>
+        </w:numPr>
+      </w:pPr>
+      <w:r>
+        <w:t xml:space="preserve">[X] Creamos la lógica MisPostulacionesActivity.java (configurando RecyclerView, llamando a la API y manejando la visibilidad del emptyState). </w:t>
+      </w:r>
+    </w:p>
+    <w:p>
+      <w:pPr>
+        <w:pStyle w:val="Prrafodelista"/>
+      </w:pPr>
+    </w:p>
+    <w:p>
+      <w:pPr>
+        <w:pStyle w:val="Prrafodelista"/>
+        <w:numPr>
+          <w:ilvl w:val="0"/>
+          <w:numId w:val="12"/>
+        </w:numPr>
+      </w:pPr>
+      <w:r>
+        <w:t xml:space="preserve">[X] Integramos la pantalla al menú principal: [X] Creamos el ícono ic_menu_postulaciones.xml. </w:t>
+      </w:r>
+    </w:p>
+    <w:p>
+      <w:pPr>
+        <w:pStyle w:val="Prrafodelista"/>
+      </w:pPr>
+    </w:p>
+    <w:p>
+      <w:pPr>
+        <w:pStyle w:val="Prrafodelista"/>
+        <w:numPr>
+          <w:ilvl w:val="0"/>
+          <w:numId w:val="12"/>
+        </w:numPr>
+      </w:pPr>
+      <w:r>
+        <w:t xml:space="preserve">[X] Añadimos el nuevo &lt;item&gt; (menu_postulaciones) a res/menu/main_menu.xml. </w:t>
+      </w:r>
+    </w:p>
+    <w:p>
+      <w:pPr>
+        <w:pStyle w:val="Prrafodelista"/>
+      </w:pPr>
+    </w:p>
+    <w:p>
+      <w:pPr>
+        <w:pStyle w:val="Prrafodelista"/>
+        <w:numPr>
+          <w:ilvl w:val="0"/>
+          <w:numId w:val="12"/>
+        </w:numPr>
+      </w:pPr>
+      <w:r>
+        <w:t>[X] Actualizamos MainActivity.java (añadiendo el else if en onOptionsItemSelected para lanzar MisPostulacionesActivity).</w:t>
+      </w:r>
+    </w:p>
+    <w:p>
+      <w:r>
+        <w:pict w14:anchorId="53C4D937">
+          <v:rect id="_x0000_i1025" style="width:0;height:1.5pt" o:hralign="center" o:hrstd="t" o:hr="t" fillcolor="#a0a0a0" stroked="f"/>
+        </w:pict>
+      </w:r>
+    </w:p>
+    <w:p>
+      <w:r>
+        <w:t xml:space="preserve">¡Excelente! Con esto, el </w:t>
+      </w:r>
+      <w:r>
+        <w:rPr>
+          <w:b/>
+          <w:bCs/>
+        </w:rPr>
+        <w:t>flujo completo del Estudiante</w:t>
+      </w:r>
+      <w:r>
+        <w:t xml:space="preserve"> está terminado. Ahora puede registrarse, ver proyectos, postularse, ver su perfil, editar su perfil y ver su historial de postulaciones. Cuando estés listo, dime "sigue" para pasar a la </w:t>
+      </w:r>
+      <w:r>
+        <w:rPr>
+          <w:b/>
+          <w:bCs/>
+        </w:rPr>
+        <w:t>Parte 12</w:t>
+      </w:r>
+      <w:r>
+        <w:t xml:space="preserve"> (el flujo del Contratista).</w:t>
       </w:r>
     </w:p>
     <w:p>
@@ -808,6 +1137,119 @@
 <file path=word/numbering.xml><?xml version="1.0" encoding="utf-8"?>
 <w:numbering xmlns:wpc="http://schemas.microsoft.com/office/word/2010/wordprocessingCanvas" xmlns:cx="http://schemas.microsoft.com/office/drawing/2014/chartex" xmlns:cx1="http://schemas.microsoft.com/office/drawing/2015/9/8/chartex" xmlns:cx2="http://schemas.microsoft.com/office/drawing/2015/10/21/chartex" xmlns:cx3="http://schemas.microsoft.com/office/drawing/2016/5/9/chartex" xmlns:cx4="http://schemas.microsoft.com/office/drawing/2016/5/10/chartex" xmlns:cx5="http://schemas.microsoft.com/office/drawing/2016/5/11/chartex" xmlns:cx6="http://schemas.microsoft.com/office/drawing/2016/5/12/chartex" xmlns:cx7="http://schemas.microsoft.com/office/drawing/2016/5/13/chartex" xmlns:cx8="http://schemas.microsoft.com/office/drawing/2016/5/14/chartex" xmlns:mc="http://schemas.openxmlformats.org/markup-compatibility/2006" xmlns:aink="http://schemas.microsoft.com/office/drawing/2016/ink" xmlns:am3d="http://schemas.microsoft.com/office/drawing/2017/model3d" xmlns:o="urn:schemas-microsoft-com:office:office" xmlns:oel="http://schemas.microsoft.com/office/2019/extlst" xmlns:r="http://schemas.openxmlformats.org/officeDocument/2006/relationships" xmlns:m="http://schemas.openxmlformats.org/officeDocument/2006/math" xmlns:v="urn:schemas-microsoft-com:vml" xmlns:wp14="http://schemas.microsoft.com/office/word/2010/wordprocessingDrawing" xmlns:wp="http://schemas.openxmlformats.org/drawingml/2006/wordprocessingDrawing" xmlns:w10="urn:schemas-microsoft-com:office:word" xmlns:w="http://schemas.openxmlformats.org/wordprocessingml/2006/main" xmlns:w14="http://schemas.microsoft.com/office/word/2010/wordml" xmlns:w15="http://schemas.microsoft.com/office/word/2012/wordml" xmlns:w16cex="http://schemas.microsoft.com/office/word/2018/wordml/cex" xmlns:w16cid="http://schemas.microsoft.com/office/word/2016/wordml/cid" xmlns:w16="http://schemas.microsoft.com/office/word/2018/wordml" xmlns:w16du="http://schemas.microsoft.com/office/word/2023/wordml/word16du" xmlns:w16sdtdh="http://schemas.microsoft.com/office/word/2020/wordml/sdtdatahash" xmlns:w16sdtfl="http://schemas.microsoft.com/office/word/2024/wordml/sdtformatlock" xmlns:w16se="http://schemas.microsoft.com/office/word/2015/wordml/symex" xmlns:wpg="http://schemas.microsoft.com/office/word/2010/wordprocessingGroup" xmlns:wpi="http://schemas.microsoft.com/office/word/2010/wordprocessingInk" xmlns:wne="http://schemas.microsoft.com/office/word/2006/wordml" xmlns:wps="http://schemas.microsoft.com/office/word/2010/wordprocessingShape" mc:Ignorable="w14 w15 w16se w16cid w16 w16cex w16sdtdh w16sdtfl w16du wp14">
   <w:abstractNum w:abstractNumId="0" w15:restartNumberingAfterBreak="0">
+    <w:nsid w:val="01525B29"/>
+    <w:multiLevelType w:val="hybridMultilevel"/>
+    <w:tmpl w:val="F050D010"/>
+    <w:lvl w:ilvl="0" w:tplc="440A0001">
+      <w:start w:val="1"/>
+      <w:numFmt w:val="bullet"/>
+      <w:lvlText w:val=""/>
+      <w:lvlJc w:val="left"/>
+      <w:pPr>
+        <w:ind w:left="720" w:hanging="360"/>
+      </w:pPr>
+      <w:rPr>
+        <w:rFonts w:ascii="Symbol" w:hAnsi="Symbol" w:hint="default"/>
+      </w:rPr>
+    </w:lvl>
+    <w:lvl w:ilvl="1" w:tplc="440A0003" w:tentative="1">
+      <w:start w:val="1"/>
+      <w:numFmt w:val="bullet"/>
+      <w:lvlText w:val="o"/>
+      <w:lvlJc w:val="left"/>
+      <w:pPr>
+        <w:ind w:left="1440" w:hanging="360"/>
+      </w:pPr>
+      <w:rPr>
+        <w:rFonts w:ascii="Courier New" w:hAnsi="Courier New" w:cs="Courier New" w:hint="default"/>
+      </w:rPr>
+    </w:lvl>
+    <w:lvl w:ilvl="2" w:tplc="440A0005" w:tentative="1">
+      <w:start w:val="1"/>
+      <w:numFmt w:val="bullet"/>
+      <w:lvlText w:val=""/>
+      <w:lvlJc w:val="left"/>
+      <w:pPr>
+        <w:ind w:left="2160" w:hanging="360"/>
+      </w:pPr>
+      <w:rPr>
+        <w:rFonts w:ascii="Wingdings" w:hAnsi="Wingdings" w:hint="default"/>
+      </w:rPr>
+    </w:lvl>
+    <w:lvl w:ilvl="3" w:tplc="440A0001" w:tentative="1">
+      <w:start w:val="1"/>
+      <w:numFmt w:val="bullet"/>
+      <w:lvlText w:val=""/>
+      <w:lvlJc w:val="left"/>
+      <w:pPr>
+        <w:ind w:left="2880" w:hanging="360"/>
+      </w:pPr>
+      <w:rPr>
+        <w:rFonts w:ascii="Symbol" w:hAnsi="Symbol" w:hint="default"/>
+      </w:rPr>
+    </w:lvl>
+    <w:lvl w:ilvl="4" w:tplc="440A0003" w:tentative="1">
+      <w:start w:val="1"/>
+      <w:numFmt w:val="bullet"/>
+      <w:lvlText w:val="o"/>
+      <w:lvlJc w:val="left"/>
+      <w:pPr>
+        <w:ind w:left="3600" w:hanging="360"/>
+      </w:pPr>
+      <w:rPr>
+        <w:rFonts w:ascii="Courier New" w:hAnsi="Courier New" w:cs="Courier New" w:hint="default"/>
+      </w:rPr>
+    </w:lvl>
+    <w:lvl w:ilvl="5" w:tplc="440A0005" w:tentative="1">
+      <w:start w:val="1"/>
+      <w:numFmt w:val="bullet"/>
+      <w:lvlText w:val=""/>
+      <w:lvlJc w:val="left"/>
+      <w:pPr>
+        <w:ind w:left="4320" w:hanging="360"/>
+      </w:pPr>
+      <w:rPr>
+        <w:rFonts w:ascii="Wingdings" w:hAnsi="Wingdings" w:hint="default"/>
+      </w:rPr>
+    </w:lvl>
+    <w:lvl w:ilvl="6" w:tplc="440A0001" w:tentative="1">
+      <w:start w:val="1"/>
+      <w:numFmt w:val="bullet"/>
+      <w:lvlText w:val=""/>
+      <w:lvlJc w:val="left"/>
+      <w:pPr>
+        <w:ind w:left="5040" w:hanging="360"/>
+      </w:pPr>
+      <w:rPr>
+        <w:rFonts w:ascii="Symbol" w:hAnsi="Symbol" w:hint="default"/>
+      </w:rPr>
+    </w:lvl>
+    <w:lvl w:ilvl="7" w:tplc="440A0003" w:tentative="1">
+      <w:start w:val="1"/>
+      <w:numFmt w:val="bullet"/>
+      <w:lvlText w:val="o"/>
+      <w:lvlJc w:val="left"/>
+      <w:pPr>
+        <w:ind w:left="5760" w:hanging="360"/>
+      </w:pPr>
+      <w:rPr>
+        <w:rFonts w:ascii="Courier New" w:hAnsi="Courier New" w:cs="Courier New" w:hint="default"/>
+      </w:rPr>
+    </w:lvl>
+    <w:lvl w:ilvl="8" w:tplc="440A0005" w:tentative="1">
+      <w:start w:val="1"/>
+      <w:numFmt w:val="bullet"/>
+      <w:lvlText w:val=""/>
+      <w:lvlJc w:val="left"/>
+      <w:pPr>
+        <w:ind w:left="6480" w:hanging="360"/>
+      </w:pPr>
+      <w:rPr>
+        <w:rFonts w:ascii="Wingdings" w:hAnsi="Wingdings" w:hint="default"/>
+      </w:rPr>
+    </w:lvl>
+  </w:abstractNum>
+  <w:abstractNum w:abstractNumId="1" w15:restartNumberingAfterBreak="0">
     <w:nsid w:val="03B6049D"/>
     <w:multiLevelType w:val="multilevel"/>
     <w:tmpl w:val="73AAD57A"/>
@@ -956,7 +1398,7 @@
       </w:rPr>
     </w:lvl>
   </w:abstractNum>
-  <w:abstractNum w:abstractNumId="1" w15:restartNumberingAfterBreak="0">
+  <w:abstractNum w:abstractNumId="2" w15:restartNumberingAfterBreak="0">
     <w:nsid w:val="067E43E1"/>
     <w:multiLevelType w:val="multilevel"/>
     <w:tmpl w:val="B3E880E0"/>
@@ -1105,7 +1547,120 @@
       </w:rPr>
     </w:lvl>
   </w:abstractNum>
-  <w:abstractNum w:abstractNumId="2" w15:restartNumberingAfterBreak="0">
+  <w:abstractNum w:abstractNumId="3" w15:restartNumberingAfterBreak="0">
+    <w:nsid w:val="1FD02780"/>
+    <w:multiLevelType w:val="hybridMultilevel"/>
+    <w:tmpl w:val="22709102"/>
+    <w:lvl w:ilvl="0" w:tplc="440A0001">
+      <w:start w:val="1"/>
+      <w:numFmt w:val="bullet"/>
+      <w:lvlText w:val=""/>
+      <w:lvlJc w:val="left"/>
+      <w:pPr>
+        <w:ind w:left="720" w:hanging="360"/>
+      </w:pPr>
+      <w:rPr>
+        <w:rFonts w:ascii="Symbol" w:hAnsi="Symbol" w:hint="default"/>
+      </w:rPr>
+    </w:lvl>
+    <w:lvl w:ilvl="1" w:tplc="440A0003" w:tentative="1">
+      <w:start w:val="1"/>
+      <w:numFmt w:val="bullet"/>
+      <w:lvlText w:val="o"/>
+      <w:lvlJc w:val="left"/>
+      <w:pPr>
+        <w:ind w:left="1440" w:hanging="360"/>
+      </w:pPr>
+      <w:rPr>
+        <w:rFonts w:ascii="Courier New" w:hAnsi="Courier New" w:cs="Courier New" w:hint="default"/>
+      </w:rPr>
+    </w:lvl>
+    <w:lvl w:ilvl="2" w:tplc="440A0005" w:tentative="1">
+      <w:start w:val="1"/>
+      <w:numFmt w:val="bullet"/>
+      <w:lvlText w:val=""/>
+      <w:lvlJc w:val="left"/>
+      <w:pPr>
+        <w:ind w:left="2160" w:hanging="360"/>
+      </w:pPr>
+      <w:rPr>
+        <w:rFonts w:ascii="Wingdings" w:hAnsi="Wingdings" w:hint="default"/>
+      </w:rPr>
+    </w:lvl>
+    <w:lvl w:ilvl="3" w:tplc="440A0001" w:tentative="1">
+      <w:start w:val="1"/>
+      <w:numFmt w:val="bullet"/>
+      <w:lvlText w:val=""/>
+      <w:lvlJc w:val="left"/>
+      <w:pPr>
+        <w:ind w:left="2880" w:hanging="360"/>
+      </w:pPr>
+      <w:rPr>
+        <w:rFonts w:ascii="Symbol" w:hAnsi="Symbol" w:hint="default"/>
+      </w:rPr>
+    </w:lvl>
+    <w:lvl w:ilvl="4" w:tplc="440A0003" w:tentative="1">
+      <w:start w:val="1"/>
+      <w:numFmt w:val="bullet"/>
+      <w:lvlText w:val="o"/>
+      <w:lvlJc w:val="left"/>
+      <w:pPr>
+        <w:ind w:left="3600" w:hanging="360"/>
+      </w:pPr>
+      <w:rPr>
+        <w:rFonts w:ascii="Courier New" w:hAnsi="Courier New" w:cs="Courier New" w:hint="default"/>
+      </w:rPr>
+    </w:lvl>
+    <w:lvl w:ilvl="5" w:tplc="440A0005" w:tentative="1">
+      <w:start w:val="1"/>
+      <w:numFmt w:val="bullet"/>
+      <w:lvlText w:val=""/>
+      <w:lvlJc w:val="left"/>
+      <w:pPr>
+        <w:ind w:left="4320" w:hanging="360"/>
+      </w:pPr>
+      <w:rPr>
+        <w:rFonts w:ascii="Wingdings" w:hAnsi="Wingdings" w:hint="default"/>
+      </w:rPr>
+    </w:lvl>
+    <w:lvl w:ilvl="6" w:tplc="440A0001" w:tentative="1">
+      <w:start w:val="1"/>
+      <w:numFmt w:val="bullet"/>
+      <w:lvlText w:val=""/>
+      <w:lvlJc w:val="left"/>
+      <w:pPr>
+        <w:ind w:left="5040" w:hanging="360"/>
+      </w:pPr>
+      <w:rPr>
+        <w:rFonts w:ascii="Symbol" w:hAnsi="Symbol" w:hint="default"/>
+      </w:rPr>
+    </w:lvl>
+    <w:lvl w:ilvl="7" w:tplc="440A0003" w:tentative="1">
+      <w:start w:val="1"/>
+      <w:numFmt w:val="bullet"/>
+      <w:lvlText w:val="o"/>
+      <w:lvlJc w:val="left"/>
+      <w:pPr>
+        <w:ind w:left="5760" w:hanging="360"/>
+      </w:pPr>
+      <w:rPr>
+        <w:rFonts w:ascii="Courier New" w:hAnsi="Courier New" w:cs="Courier New" w:hint="default"/>
+      </w:rPr>
+    </w:lvl>
+    <w:lvl w:ilvl="8" w:tplc="440A0005" w:tentative="1">
+      <w:start w:val="1"/>
+      <w:numFmt w:val="bullet"/>
+      <w:lvlText w:val=""/>
+      <w:lvlJc w:val="left"/>
+      <w:pPr>
+        <w:ind w:left="6480" w:hanging="360"/>
+      </w:pPr>
+      <w:rPr>
+        <w:rFonts w:ascii="Wingdings" w:hAnsi="Wingdings" w:hint="default"/>
+      </w:rPr>
+    </w:lvl>
+  </w:abstractNum>
+  <w:abstractNum w:abstractNumId="4" w15:restartNumberingAfterBreak="0">
     <w:nsid w:val="2519687B"/>
     <w:multiLevelType w:val="multilevel"/>
     <w:tmpl w:val="23CA5E78"/>
@@ -1254,7 +1809,7 @@
       </w:rPr>
     </w:lvl>
   </w:abstractNum>
-  <w:abstractNum w:abstractNumId="3" w15:restartNumberingAfterBreak="0">
+  <w:abstractNum w:abstractNumId="5" w15:restartNumberingAfterBreak="0">
     <w:nsid w:val="3040513F"/>
     <w:multiLevelType w:val="multilevel"/>
     <w:tmpl w:val="4E1E335C"/>
@@ -1403,7 +1958,7 @@
       </w:rPr>
     </w:lvl>
   </w:abstractNum>
-  <w:abstractNum w:abstractNumId="4" w15:restartNumberingAfterBreak="0">
+  <w:abstractNum w:abstractNumId="6" w15:restartNumberingAfterBreak="0">
     <w:nsid w:val="363C64F1"/>
     <w:multiLevelType w:val="multilevel"/>
     <w:tmpl w:val="8F4A7694"/>
@@ -1552,7 +2107,7 @@
       </w:rPr>
     </w:lvl>
   </w:abstractNum>
-  <w:abstractNum w:abstractNumId="5" w15:restartNumberingAfterBreak="0">
+  <w:abstractNum w:abstractNumId="7" w15:restartNumberingAfterBreak="0">
     <w:nsid w:val="3AE8161E"/>
     <w:multiLevelType w:val="multilevel"/>
     <w:tmpl w:val="655E33E2"/>
@@ -1701,7 +2256,7 @@
       </w:rPr>
     </w:lvl>
   </w:abstractNum>
-  <w:abstractNum w:abstractNumId="6" w15:restartNumberingAfterBreak="0">
+  <w:abstractNum w:abstractNumId="8" w15:restartNumberingAfterBreak="0">
     <w:nsid w:val="4B077E2A"/>
     <w:multiLevelType w:val="multilevel"/>
     <w:tmpl w:val="B2E451FE"/>
@@ -1850,7 +2405,7 @@
       </w:rPr>
     </w:lvl>
   </w:abstractNum>
-  <w:abstractNum w:abstractNumId="7" w15:restartNumberingAfterBreak="0">
+  <w:abstractNum w:abstractNumId="9" w15:restartNumberingAfterBreak="0">
     <w:nsid w:val="605273DB"/>
     <w:multiLevelType w:val="multilevel"/>
     <w:tmpl w:val="EE9EE85C"/>
@@ -1999,7 +2554,7 @@
       </w:rPr>
     </w:lvl>
   </w:abstractNum>
-  <w:abstractNum w:abstractNumId="8" w15:restartNumberingAfterBreak="0">
+  <w:abstractNum w:abstractNumId="10" w15:restartNumberingAfterBreak="0">
     <w:nsid w:val="6B951066"/>
     <w:multiLevelType w:val="multilevel"/>
     <w:tmpl w:val="8232616A"/>
@@ -2148,7 +2703,7 @@
       </w:rPr>
     </w:lvl>
   </w:abstractNum>
-  <w:abstractNum w:abstractNumId="9" w15:restartNumberingAfterBreak="0">
+  <w:abstractNum w:abstractNumId="11" w15:restartNumberingAfterBreak="0">
     <w:nsid w:val="724476A0"/>
     <w:multiLevelType w:val="multilevel"/>
     <w:tmpl w:val="31AE67F6"/>
@@ -2297,7 +2852,7 @@
       </w:rPr>
     </w:lvl>
   </w:abstractNum>
-  <w:abstractNum w:abstractNumId="10" w15:restartNumberingAfterBreak="0">
+  <w:abstractNum w:abstractNumId="12" w15:restartNumberingAfterBreak="0">
     <w:nsid w:val="79F16FDD"/>
     <w:multiLevelType w:val="multilevel"/>
     <w:tmpl w:val="7FE03F74"/>
@@ -2447,37 +3002,43 @@
     </w:lvl>
   </w:abstractNum>
   <w:num w:numId="1" w16cid:durableId="1492984316">
+    <w:abstractNumId w:val="7"/>
+  </w:num>
+  <w:num w:numId="2" w16cid:durableId="869728568">
+    <w:abstractNumId w:val="1"/>
+  </w:num>
+  <w:num w:numId="3" w16cid:durableId="1433748183">
+    <w:abstractNumId w:val="10"/>
+  </w:num>
+  <w:num w:numId="4" w16cid:durableId="1229072388">
+    <w:abstractNumId w:val="12"/>
+  </w:num>
+  <w:num w:numId="5" w16cid:durableId="1996295867">
+    <w:abstractNumId w:val="8"/>
+  </w:num>
+  <w:num w:numId="6" w16cid:durableId="1677610832">
+    <w:abstractNumId w:val="9"/>
+  </w:num>
+  <w:num w:numId="7" w16cid:durableId="984159764">
+    <w:abstractNumId w:val="2"/>
+  </w:num>
+  <w:num w:numId="8" w16cid:durableId="1452282834">
     <w:abstractNumId w:val="5"/>
   </w:num>
-  <w:num w:numId="2" w16cid:durableId="869728568">
+  <w:num w:numId="9" w16cid:durableId="1395397423">
+    <w:abstractNumId w:val="4"/>
+  </w:num>
+  <w:num w:numId="10" w16cid:durableId="1254314425">
+    <w:abstractNumId w:val="6"/>
+  </w:num>
+  <w:num w:numId="11" w16cid:durableId="1691254675">
+    <w:abstractNumId w:val="11"/>
+  </w:num>
+  <w:num w:numId="12" w16cid:durableId="17898657">
     <w:abstractNumId w:val="0"/>
   </w:num>
-  <w:num w:numId="3" w16cid:durableId="1433748183">
-    <w:abstractNumId w:val="8"/>
-  </w:num>
-  <w:num w:numId="4" w16cid:durableId="1229072388">
-    <w:abstractNumId w:val="10"/>
-  </w:num>
-  <w:num w:numId="5" w16cid:durableId="1996295867">
-    <w:abstractNumId w:val="6"/>
-  </w:num>
-  <w:num w:numId="6" w16cid:durableId="1677610832">
-    <w:abstractNumId w:val="7"/>
-  </w:num>
-  <w:num w:numId="7" w16cid:durableId="984159764">
-    <w:abstractNumId w:val="1"/>
-  </w:num>
-  <w:num w:numId="8" w16cid:durableId="1452282834">
+  <w:num w:numId="13" w16cid:durableId="892235610">
     <w:abstractNumId w:val="3"/>
-  </w:num>
-  <w:num w:numId="9" w16cid:durableId="1395397423">
-    <w:abstractNumId w:val="2"/>
-  </w:num>
-  <w:num w:numId="10" w16cid:durableId="1254314425">
-    <w:abstractNumId w:val="4"/>
-  </w:num>
-  <w:num w:numId="11" w16cid:durableId="1691254675">
-    <w:abstractNumId w:val="9"/>
   </w:num>
 </w:numbering>
 </file>

</xml_diff>

<commit_message>
feat(alpha): Vista de estudiante casi lista para empezar con contratista
</commit_message>
<xml_diff>
--- a/Contexto del progreso.docx
+++ b/Contexto del progreso.docx
@@ -1085,6 +1085,801 @@
         <w:t>[X] Actualizamos MainActivity.java (añadiendo el else if en onOptionsItemSelected para lanzar MisPostulacionesActivity).</w:t>
       </w:r>
     </w:p>
+    <w:p/>
+    <w:p>
+      <w:r>
+        <w:rPr>
+          <w:b/>
+          <w:bCs/>
+        </w:rPr>
+        <w:t>Parte 12: Creación de API Provisional (XAMPP/PHP) y Depuración Inicial</w:t>
+      </w:r>
+      <w:r>
+        <w:t xml:space="preserve"> </w:t>
+      </w:r>
+    </w:p>
+    <w:p>
+      <w:pPr>
+        <w:pStyle w:val="Prrafodelista"/>
+        <w:numPr>
+          <w:ilvl w:val="0"/>
+          <w:numId w:val="16"/>
+        </w:numPr>
+      </w:pPr>
+      <w:r>
+        <w:t xml:space="preserve">[X] Creamos la carpeta hirelance_api en htdocs de XAMPP y el script db.php para la conexión a la base de datos hirelance_db. </w:t>
+      </w:r>
+    </w:p>
+    <w:p>
+      <w:pPr>
+        <w:pStyle w:val="Prrafodelista"/>
+        <w:numPr>
+          <w:ilvl w:val="0"/>
+          <w:numId w:val="16"/>
+        </w:numPr>
+      </w:pPr>
+      <w:r>
+        <w:t xml:space="preserve">[X] Creamos los </w:t>
+      </w:r>
+      <w:r>
+        <w:rPr>
+          <w:i/>
+          <w:iCs/>
+        </w:rPr>
+        <w:t>endpoints</w:t>
+      </w:r>
+      <w:r>
+        <w:t xml:space="preserve"> iniciales de PHP (ej. login.php, getProyectos.php). [X] </w:t>
+      </w:r>
+      <w:r>
+        <w:rPr>
+          <w:b/>
+          <w:bCs/>
+        </w:rPr>
+        <w:t>Fase de Depuración de Conexión:</w:t>
+      </w:r>
+      <w:r>
+        <w:t xml:space="preserve"> </w:t>
+      </w:r>
+    </w:p>
+    <w:p>
+      <w:pPr>
+        <w:pStyle w:val="Prrafodelista"/>
+        <w:numPr>
+          <w:ilvl w:val="0"/>
+          <w:numId w:val="16"/>
+        </w:numPr>
+      </w:pPr>
+      <w:r>
+        <w:t xml:space="preserve">[X] Corregimos AndroidManifest.xml para añadir android:usesCleartextTraffic="true". </w:t>
+      </w:r>
+    </w:p>
+    <w:p>
+      <w:pPr>
+        <w:pStyle w:val="Prrafodelista"/>
+        <w:numPr>
+          <w:ilvl w:val="0"/>
+          <w:numId w:val="16"/>
+        </w:numPr>
+      </w:pPr>
+      <w:r>
+        <w:t xml:space="preserve">[X] Corregimos ApiService.java: cambiamos todas las URLs de los </w:t>
+      </w:r>
+      <w:r>
+        <w:rPr>
+          <w:i/>
+          <w:iCs/>
+        </w:rPr>
+        <w:t>endpoints</w:t>
+      </w:r>
+      <w:r>
+        <w:t xml:space="preserve"> (ej. auth/login) a nombres de archivos PHP (ej. login.php). </w:t>
+      </w:r>
+    </w:p>
+    <w:p>
+      <w:pPr>
+        <w:pStyle w:val="Prrafodelista"/>
+        <w:numPr>
+          <w:ilvl w:val="0"/>
+          <w:numId w:val="16"/>
+        </w:numPr>
+      </w:pPr>
+      <w:r>
+        <w:t xml:space="preserve">[X] Corregimos login.php: cambiamos la lectura de datos de json_decode a $_POST para coincidir con el envío @FormUrlEncoded de Retrofit en LoginActivity. </w:t>
+      </w:r>
+    </w:p>
+    <w:p>
+      <w:pPr>
+        <w:pStyle w:val="Prrafodelista"/>
+        <w:numPr>
+          <w:ilvl w:val="0"/>
+          <w:numId w:val="16"/>
+        </w:numPr>
+      </w:pPr>
+      <w:r>
+        <w:lastRenderedPageBreak/>
+        <w:t xml:space="preserve">[X] </w:t>
+      </w:r>
+      <w:r>
+        <w:rPr>
+          <w:b/>
+          <w:bCs/>
+        </w:rPr>
+        <w:t>Fase de Depuración de GSON (Parsing de Fechas):</w:t>
+      </w:r>
+      <w:r>
+        <w:t xml:space="preserve"> </w:t>
+      </w:r>
+    </w:p>
+    <w:p>
+      <w:pPr>
+        <w:pStyle w:val="Prrafodelista"/>
+        <w:numPr>
+          <w:ilvl w:val="0"/>
+          <w:numId w:val="16"/>
+        </w:numPr>
+      </w:pPr>
+      <w:r>
+        <w:t xml:space="preserve">[X] Solucionamos el </w:t>
+      </w:r>
+      <w:r>
+        <w:rPr>
+          <w:i/>
+          <w:iCs/>
+        </w:rPr>
+        <w:t>crash</w:t>
+      </w:r>
+      <w:r>
+        <w:t xml:space="preserve"> onFailure: Failed parsing '2025-11-07...' al iniciar sesión y al cargar proyectos. </w:t>
+      </w:r>
+    </w:p>
+    <w:p>
+      <w:pPr>
+        <w:pStyle w:val="Prrafodelista"/>
+        <w:numPr>
+          <w:ilvl w:val="0"/>
+          <w:numId w:val="16"/>
+        </w:numPr>
+      </w:pPr>
+      <w:r>
+        <w:t xml:space="preserve">[X] </w:t>
+      </w:r>
+      <w:r>
+        <w:rPr>
+          <w:b/>
+          <w:bCs/>
+        </w:rPr>
+        <w:t>Solución:</w:t>
+      </w:r>
+      <w:r>
+        <w:t xml:space="preserve"> Actualizamos los POJOs Usuario.java, Proyecto.java y Postulacion.java, cambiando todos los campos de fecha (ej. fecha_registro, fecha_publicacion) de Date a String. </w:t>
+      </w:r>
+    </w:p>
+    <w:p>
+      <w:pPr>
+        <w:pStyle w:val="Prrafodelista"/>
+        <w:numPr>
+          <w:ilvl w:val="0"/>
+          <w:numId w:val="16"/>
+        </w:numPr>
+      </w:pPr>
+      <w:r>
+        <w:t xml:space="preserve">[X] </w:t>
+      </w:r>
+      <w:r>
+        <w:rPr>
+          <w:b/>
+          <w:bCs/>
+        </w:rPr>
+        <w:t>Fase de Depuración de Lógica de App:</w:t>
+      </w:r>
+      <w:r>
+        <w:t xml:space="preserve"> </w:t>
+      </w:r>
+    </w:p>
+    <w:p>
+      <w:pPr>
+        <w:pStyle w:val="Prrafodelista"/>
+        <w:numPr>
+          <w:ilvl w:val="0"/>
+          <w:numId w:val="16"/>
+        </w:numPr>
+      </w:pPr>
+      <w:r>
+        <w:t xml:space="preserve">[X] Corregimos getProyectos.php para enviar el objeto contratista (en lugar de usuario) para coincidir con el POJO Proyecto.java y arreglar el NullPointerException en la lista. </w:t>
+      </w:r>
+    </w:p>
+    <w:p>
+      <w:pPr>
+        <w:pStyle w:val="Prrafodelista"/>
+        <w:numPr>
+          <w:ilvl w:val="0"/>
+          <w:numId w:val="16"/>
+        </w:numPr>
+      </w:pPr>
+      <w:r>
+        <w:t xml:space="preserve">[X] Corregimos DetalleProyectoActivity.java para que deje de usar SimpleDateFormat en fechas (que ahora son String) y evitar el </w:t>
+      </w:r>
+      <w:r>
+        <w:rPr>
+          <w:i/>
+          <w:iCs/>
+        </w:rPr>
+        <w:t>crash</w:t>
+      </w:r>
+      <w:r>
+        <w:t xml:space="preserve"> al ver detalles. </w:t>
+      </w:r>
+    </w:p>
+    <w:p>
+      <w:pPr>
+        <w:pStyle w:val="Prrafodelista"/>
+        <w:numPr>
+          <w:ilvl w:val="0"/>
+          <w:numId w:val="16"/>
+        </w:numPr>
+      </w:pPr>
+      <w:r>
+        <w:t xml:space="preserve">[X] Implementamos la lógica de ActivityResultLauncher en DetalleProyectoActivity.java y PostulacionActivity.java para refrescar la pantalla después de una postulación exitosa. </w:t>
+      </w:r>
+    </w:p>
+    <w:p>
+      <w:pPr>
+        <w:pStyle w:val="Prrafodelista"/>
+        <w:numPr>
+          <w:ilvl w:val="0"/>
+          <w:numId w:val="16"/>
+        </w:numPr>
+      </w:pPr>
+      <w:r>
+        <w:t xml:space="preserve">[X] Implementamos todos los </w:t>
+      </w:r>
+      <w:r>
+        <w:rPr>
+          <w:i/>
+          <w:iCs/>
+        </w:rPr>
+        <w:t>endpoints</w:t>
+      </w:r>
+      <w:r>
+        <w:t xml:space="preserve"> restantes del flujo de estudiante (getProyectoDetalle.php, enviarPostulacion.php, getMiPerfil.php, actualizarMiPerfil.php y getMisPostulaciones.php).</w:t>
+      </w:r>
+    </w:p>
+    <w:p>
+      <w:r>
+        <w:rPr>
+          <w:b/>
+          <w:bCs/>
+        </w:rPr>
+        <w:t>Parte 13: Implementación de Registro de Estudiante Completo (Multi-tabla y BLOB)</w:t>
+      </w:r>
+      <w:r>
+        <w:t xml:space="preserve"> </w:t>
+      </w:r>
+    </w:p>
+    <w:p>
+      <w:pPr>
+        <w:pStyle w:val="Prrafodelista"/>
+        <w:numPr>
+          <w:ilvl w:val="0"/>
+          <w:numId w:val="15"/>
+        </w:numPr>
+      </w:pPr>
+      <w:r>
+        <w:t xml:space="preserve">[X] Alteramos la tabla perfil_estudiante en MySQL para cambiar foto_perfil de VARCHAR(255) a MEDIUMBLOB, para guardar imágenes. </w:t>
+      </w:r>
+    </w:p>
+    <w:p>
+      <w:pPr>
+        <w:pStyle w:val="Prrafodelista"/>
+        <w:numPr>
+          <w:ilvl w:val="0"/>
+          <w:numId w:val="15"/>
+        </w:numPr>
+      </w:pPr>
+      <w:r>
+        <w:t xml:space="preserve">[X] Reemplazamos activity_register.xml por un formulario completo (campos académicos, ImageView para foto, etc.). </w:t>
+      </w:r>
+    </w:p>
+    <w:p>
+      <w:pPr>
+        <w:pStyle w:val="Prrafodelista"/>
+        <w:numPr>
+          <w:ilvl w:val="0"/>
+          <w:numId w:val="15"/>
+        </w:numPr>
+      </w:pPr>
+      <w:r>
+        <w:t xml:space="preserve">[X] Añadimos el string-array de anios_carrera a strings.xml. </w:t>
+      </w:r>
+    </w:p>
+    <w:p>
+      <w:pPr>
+        <w:pStyle w:val="Prrafodelista"/>
+        <w:numPr>
+          <w:ilvl w:val="0"/>
+          <w:numId w:val="15"/>
+        </w:numPr>
+      </w:pPr>
+      <w:r>
+        <w:t>[X] Añadimos el permiso READ_EXTERNAL_STORAGE al AndroidManifest.xml.</w:t>
+      </w:r>
+    </w:p>
+    <w:p>
+      <w:pPr>
+        <w:pStyle w:val="Prrafodelista"/>
+        <w:numPr>
+          <w:ilvl w:val="0"/>
+          <w:numId w:val="15"/>
+        </w:numPr>
+      </w:pPr>
+      <w:r>
+        <w:t xml:space="preserve">[X] Creamos el DTO RegisterEstudianteDTO.java usando snake_case (ej. anio_carrera) para coincidir con la BD. </w:t>
+      </w:r>
+    </w:p>
+    <w:p>
+      <w:pPr>
+        <w:pStyle w:val="Prrafodelista"/>
+        <w:numPr>
+          <w:ilvl w:val="0"/>
+          <w:numId w:val="15"/>
+        </w:numPr>
+      </w:pPr>
+      <w:r>
+        <w:t xml:space="preserve">[X] Actualizamos ApiService.java con el nuevo </w:t>
+      </w:r>
+      <w:r>
+        <w:rPr>
+          <w:i/>
+          <w:iCs/>
+        </w:rPr>
+        <w:t>endpoint</w:t>
+      </w:r>
+      <w:r>
+        <w:t xml:space="preserve"> registerEstudiante(@Body RegisterEstudianteDTO dto). </w:t>
+      </w:r>
+    </w:p>
+    <w:p>
+      <w:pPr>
+        <w:pStyle w:val="Prrafodelista"/>
+        <w:numPr>
+          <w:ilvl w:val="0"/>
+          <w:numId w:val="15"/>
+        </w:numPr>
+      </w:pPr>
+      <w:r>
+        <w:t xml:space="preserve">[X] Reemplazamos RegisterActivity.java: </w:t>
+      </w:r>
+    </w:p>
+    <w:p>
+      <w:pPr>
+        <w:pStyle w:val="Prrafodelista"/>
+        <w:numPr>
+          <w:ilvl w:val="0"/>
+          <w:numId w:val="15"/>
+        </w:numPr>
+      </w:pPr>
+      <w:r>
+        <w:t xml:space="preserve">[X] Se añadió la lógica del ActivityResultLauncher para abrir la galería. [X] Se añadieron los métodos uriToBitmap y bitmapToBase64 para convertir la imagen al formato MEDIUMBLOB. </w:t>
+      </w:r>
+    </w:p>
+    <w:p>
+      <w:pPr>
+        <w:pStyle w:val="Prrafodelista"/>
+        <w:numPr>
+          <w:ilvl w:val="0"/>
+          <w:numId w:val="15"/>
+        </w:numPr>
+      </w:pPr>
+      <w:r>
+        <w:lastRenderedPageBreak/>
+        <w:t xml:space="preserve">[X] Se actualizó intentarRegistro() para poblar y enviar el RegisterEstudianteDTO. [X] Creamos el script registerEstudiante.php: </w:t>
+      </w:r>
+    </w:p>
+    <w:p>
+      <w:pPr>
+        <w:pStyle w:val="Prrafodelista"/>
+        <w:numPr>
+          <w:ilvl w:val="0"/>
+          <w:numId w:val="15"/>
+        </w:numPr>
+      </w:pPr>
+      <w:r>
+        <w:t xml:space="preserve">[X] Usa beginTransaction(), commit() y rollBack() para transacciones seguras. [X] Inserta en usuarios, perfil_estudiante (decodificando Base64 para el MEDIUMBLOB) y habilidad_estudiante (dividiendo el string de habilidades). </w:t>
+      </w:r>
+    </w:p>
+    <w:p>
+      <w:pPr>
+        <w:pStyle w:val="Prrafodelista"/>
+        <w:numPr>
+          <w:ilvl w:val="0"/>
+          <w:numId w:val="15"/>
+        </w:numPr>
+      </w:pPr>
+      <w:r>
+        <w:t xml:space="preserve">[X] </w:t>
+      </w:r>
+      <w:r>
+        <w:rPr>
+          <w:b/>
+          <w:bCs/>
+        </w:rPr>
+        <w:t>Fase de Depuración de Registro:</w:t>
+      </w:r>
+      <w:r>
+        <w:t xml:space="preserve"> </w:t>
+      </w:r>
+    </w:p>
+    <w:p>
+      <w:pPr>
+        <w:pStyle w:val="Prrafodelista"/>
+        <w:numPr>
+          <w:ilvl w:val="0"/>
+          <w:numId w:val="15"/>
+        </w:numPr>
+      </w:pPr>
+      <w:r>
+        <w:t xml:space="preserve">[X] Solucionamos el error setLenient(true) asegurando que los nombres en el DTO (snake_case) coincidieran con el script PHP. </w:t>
+      </w:r>
+    </w:p>
+    <w:p>
+      <w:pPr>
+        <w:pStyle w:val="Prrafodelista"/>
+        <w:numPr>
+          <w:ilvl w:val="0"/>
+          <w:numId w:val="15"/>
+        </w:numPr>
+      </w:pPr>
+      <w:r>
+        <w:t xml:space="preserve">[X] Añadimos ini_set('display_errors', 0); a los scripts PHP para suprimir Warnings y asegurar respuestas JSON limpias. </w:t>
+      </w:r>
+    </w:p>
+    <w:p>
+      <w:pPr>
+        <w:pStyle w:val="Prrafodelista"/>
+        <w:numPr>
+          <w:ilvl w:val="0"/>
+          <w:numId w:val="15"/>
+        </w:numPr>
+      </w:pPr>
+      <w:r>
+        <w:t xml:space="preserve">[X] </w:t>
+      </w:r>
+      <w:r>
+        <w:rPr>
+          <w:b/>
+          <w:bCs/>
+        </w:rPr>
+        <w:t>Éxito:</w:t>
+      </w:r>
+      <w:r>
+        <w:t xml:space="preserve"> El registro se completó.</w:t>
+      </w:r>
+    </w:p>
+    <w:p>
+      <w:r>
+        <w:rPr>
+          <w:b/>
+          <w:bCs/>
+        </w:rPr>
+        <w:t>Parte 14: Refinamiento de Perfil (Visualización y Edición Avanzada)</w:t>
+      </w:r>
+      <w:r>
+        <w:t xml:space="preserve"> [X] </w:t>
+      </w:r>
+      <w:r>
+        <w:rPr>
+          <w:b/>
+          <w:bCs/>
+        </w:rPr>
+        <w:t>Visualización de Perfil (BLOBs):</w:t>
+      </w:r>
+      <w:r>
+        <w:t xml:space="preserve"> </w:t>
+      </w:r>
+    </w:p>
+    <w:p>
+      <w:pPr>
+        <w:pStyle w:val="Prrafodelista"/>
+        <w:numPr>
+          <w:ilvl w:val="0"/>
+          <w:numId w:val="14"/>
+        </w:numPr>
+      </w:pPr>
+      <w:r>
+        <w:rPr>
+          <w:lang w:val="en-US"/>
+        </w:rPr>
+        <w:t xml:space="preserve">[X] Solucionamos el </w:t>
+      </w:r>
+      <w:r>
+        <w:rPr>
+          <w:i/>
+          <w:iCs/>
+          <w:lang w:val="en-US"/>
+        </w:rPr>
+        <w:t>crash</w:t>
+      </w:r>
+      <w:r>
+        <w:rPr>
+          <w:lang w:val="en-US"/>
+        </w:rPr>
+        <w:t xml:space="preserve"> onFailure: End of input. </w:t>
+      </w:r>
+      <w:r>
+        <w:t xml:space="preserve">Causa: json_encode() de PHP no puede manejar datos binarios MEDIUMBLOB. </w:t>
+      </w:r>
+    </w:p>
+    <w:p>
+      <w:pPr>
+        <w:pStyle w:val="Prrafodelista"/>
+        <w:numPr>
+          <w:ilvl w:val="0"/>
+          <w:numId w:val="14"/>
+        </w:numPr>
+      </w:pPr>
+      <w:r>
+        <w:t xml:space="preserve">[X] </w:t>
+      </w:r>
+      <w:r>
+        <w:rPr>
+          <w:b/>
+          <w:bCs/>
+        </w:rPr>
+        <w:t>Solución:</w:t>
+      </w:r>
+      <w:r>
+        <w:t xml:space="preserve"> Modificamos getMiPerfil.php para codificar la foto_perfil a Base64 (base64_encode()). </w:t>
+      </w:r>
+    </w:p>
+    <w:p>
+      <w:pPr>
+        <w:pStyle w:val="Prrafodelista"/>
+        <w:numPr>
+          <w:ilvl w:val="0"/>
+          <w:numId w:val="14"/>
+        </w:numPr>
+      </w:pPr>
+      <w:r>
+        <w:t xml:space="preserve">[X] Modificamos PerfilEstudianteActivity.java (pintarDatos) para decodificar el string Base64 (Base64.decode()) y mostrarlo como Bitmap. </w:t>
+      </w:r>
+    </w:p>
+    <w:p>
+      <w:pPr>
+        <w:pStyle w:val="Prrafodelista"/>
+        <w:numPr>
+          <w:ilvl w:val="0"/>
+          <w:numId w:val="14"/>
+        </w:numPr>
+      </w:pPr>
+      <w:r>
+        <w:t xml:space="preserve">[X] </w:t>
+      </w:r>
+      <w:r>
+        <w:rPr>
+          <w:b/>
+          <w:bCs/>
+        </w:rPr>
+        <w:t>Visualización de Universidades (BLOBs):</w:t>
+      </w:r>
+      <w:r>
+        <w:t xml:space="preserve"> [X] Creamos el POJO Universidad.java (para recibir logo como Base64). </w:t>
+      </w:r>
+    </w:p>
+    <w:p>
+      <w:pPr>
+        <w:pStyle w:val="Prrafodelista"/>
+        <w:numPr>
+          <w:ilvl w:val="0"/>
+          <w:numId w:val="14"/>
+        </w:numPr>
+      </w:pPr>
+      <w:r>
+        <w:t xml:space="preserve">[X] Actualizamos PerfilEstudiante.java para incluir List&lt;Universidad&gt;. </w:t>
+      </w:r>
+    </w:p>
+    <w:p>
+      <w:pPr>
+        <w:pStyle w:val="Prrafodelista"/>
+        <w:numPr>
+          <w:ilvl w:val="0"/>
+          <w:numId w:val="14"/>
+        </w:numPr>
+      </w:pPr>
+      <w:r>
+        <w:t xml:space="preserve">[X] Actualizamos getMiPerfil.php para unir las tablas universidad y estudiante_universidad, y base64_encode() de los logos MEDIUMBLOB. </w:t>
+      </w:r>
+    </w:p>
+    <w:p>
+      <w:pPr>
+        <w:pStyle w:val="Prrafodelista"/>
+        <w:numPr>
+          <w:ilvl w:val="0"/>
+          <w:numId w:val="14"/>
+        </w:numPr>
+      </w:pPr>
+      <w:r>
+        <w:t xml:space="preserve">[X] Creamos item_universidad.xml y UniversidadAdapter.java (con lógica de decodificación Base64). </w:t>
+      </w:r>
+    </w:p>
+    <w:p>
+      <w:pPr>
+        <w:pStyle w:val="Prrafodelista"/>
+        <w:numPr>
+          <w:ilvl w:val="0"/>
+          <w:numId w:val="14"/>
+        </w:numPr>
+      </w:pPr>
+      <w:r>
+        <w:t xml:space="preserve">[X] Actualizamos activity_perfil_estudiante.xml y PerfilEstudianteActivity.java para mostrar el nuevo RecyclerView. </w:t>
+      </w:r>
+    </w:p>
+    <w:p>
+      <w:pPr>
+        <w:pStyle w:val="Prrafodelista"/>
+        <w:numPr>
+          <w:ilvl w:val="0"/>
+          <w:numId w:val="14"/>
+        </w:numPr>
+      </w:pPr>
+      <w:r>
+        <w:t xml:space="preserve">[X] </w:t>
+      </w:r>
+      <w:r>
+        <w:rPr>
+          <w:b/>
+          <w:bCs/>
+        </w:rPr>
+        <w:t>Edición Completa (Correo, Contraseña, Foto):</w:t>
+      </w:r>
+      <w:r>
+        <w:t xml:space="preserve"> </w:t>
+      </w:r>
+    </w:p>
+    <w:p>
+      <w:pPr>
+        <w:pStyle w:val="Prrafodelista"/>
+        <w:numPr>
+          <w:ilvl w:val="0"/>
+          <w:numId w:val="14"/>
+        </w:numPr>
+      </w:pPr>
+      <w:r>
+        <w:t xml:space="preserve">[X] Actualizamos activity_editar_perfil.xml para incluir campos de correo, contraseña y un botón para cambiar foto. </w:t>
+      </w:r>
+    </w:p>
+    <w:p>
+      <w:pPr>
+        <w:pStyle w:val="Prrafodelista"/>
+        <w:numPr>
+          <w:ilvl w:val="0"/>
+          <w:numId w:val="14"/>
+        </w:numPr>
+      </w:pPr>
+      <w:r>
+        <w:t xml:space="preserve">[X] Actualizamos actualizarMiPerfil.php para manejar UPDATE en usuarios (correo, contraseña) y perfil_estudiante (incluyendo la nueva foto Base64). </w:t>
+      </w:r>
+    </w:p>
+    <w:p>
+      <w:pPr>
+        <w:pStyle w:val="Prrafodelista"/>
+        <w:numPr>
+          <w:ilvl w:val="0"/>
+          <w:numId w:val="14"/>
+        </w:numPr>
+      </w:pPr>
+      <w:r>
+        <w:t xml:space="preserve">[X] </w:t>
+      </w:r>
+      <w:r>
+        <w:rPr>
+          <w:b/>
+          <w:bCs/>
+        </w:rPr>
+        <w:t>Manejo de TransactionTooLargeException:</w:t>
+      </w:r>
+      <w:r>
+        <w:t xml:space="preserve"> </w:t>
+      </w:r>
+    </w:p>
+    <w:p>
+      <w:pPr>
+        <w:pStyle w:val="Prrafodelista"/>
+        <w:numPr>
+          <w:ilvl w:val="0"/>
+          <w:numId w:val="14"/>
+        </w:numPr>
+      </w:pPr>
+      <w:r>
+        <w:lastRenderedPageBreak/>
+        <w:t xml:space="preserve">[X] Solucionamos el </w:t>
+      </w:r>
+      <w:r>
+        <w:rPr>
+          <w:i/>
+          <w:iCs/>
+        </w:rPr>
+        <w:t>crash</w:t>
+      </w:r>
+      <w:r>
+        <w:t xml:space="preserve"> al abrir EditarPerfilActivity. Causa: El objeto PerfilEstudiante (con fotos Base64) era demasiado grande para pasarlo en un Intent. </w:t>
+      </w:r>
+    </w:p>
+    <w:p>
+      <w:pPr>
+        <w:pStyle w:val="Prrafodelista"/>
+        <w:numPr>
+          <w:ilvl w:val="0"/>
+          <w:numId w:val="14"/>
+        </w:numPr>
+      </w:pPr>
+      <w:r>
+        <w:t xml:space="preserve">[X] </w:t>
+      </w:r>
+      <w:r>
+        <w:rPr>
+          <w:b/>
+          <w:bCs/>
+        </w:rPr>
+        <w:t>Solución:</w:t>
+      </w:r>
+      <w:r>
+        <w:t xml:space="preserve"> Modificamos PerfilEstudianteActivity.java para que </w:t>
+      </w:r>
+      <w:r>
+        <w:rPr>
+          <w:i/>
+          <w:iCs/>
+        </w:rPr>
+        <w:t>solo</w:t>
+      </w:r>
+      <w:r>
+        <w:t xml:space="preserve"> envíe el id_usuario. </w:t>
+      </w:r>
+    </w:p>
+    <w:p>
+      <w:pPr>
+        <w:pStyle w:val="Prrafodelista"/>
+        <w:numPr>
+          <w:ilvl w:val="0"/>
+          <w:numId w:val="14"/>
+        </w:numPr>
+      </w:pPr>
+      <w:r>
+        <w:t xml:space="preserve">[X] </w:t>
+      </w:r>
+      <w:r>
+        <w:rPr>
+          <w:b/>
+          <w:bCs/>
+        </w:rPr>
+        <w:t>Solución:</w:t>
+      </w:r>
+      <w:r>
+        <w:t xml:space="preserve"> Re-escribimos EditarPerfilActivity.java para que cargue sus </w:t>
+      </w:r>
+      <w:r>
+        <w:rPr>
+          <w:i/>
+          <w:iCs/>
+        </w:rPr>
+        <w:t>propios</w:t>
+      </w:r>
+      <w:r>
+        <w:t xml:space="preserve"> datos llamando a getMiPerfil.php en su onCreate, evitando el </w:t>
+      </w:r>
+      <w:r>
+        <w:rPr>
+          <w:i/>
+          <w:iCs/>
+        </w:rPr>
+        <w:t>crash</w:t>
+      </w:r>
+      <w:r>
+        <w:t>.</w:t>
+      </w:r>
+    </w:p>
+    <w:p/>
     <w:p>
       <w:r>
         <w:pict w14:anchorId="53C4D937">
@@ -1548,6 +2343,232 @@
     </w:lvl>
   </w:abstractNum>
   <w:abstractNum w:abstractNumId="3" w15:restartNumberingAfterBreak="0">
+    <w:nsid w:val="1AE27517"/>
+    <w:multiLevelType w:val="hybridMultilevel"/>
+    <w:tmpl w:val="AF863480"/>
+    <w:lvl w:ilvl="0" w:tplc="440A0001">
+      <w:start w:val="1"/>
+      <w:numFmt w:val="bullet"/>
+      <w:lvlText w:val=""/>
+      <w:lvlJc w:val="left"/>
+      <w:pPr>
+        <w:ind w:left="720" w:hanging="360"/>
+      </w:pPr>
+      <w:rPr>
+        <w:rFonts w:ascii="Symbol" w:hAnsi="Symbol" w:hint="default"/>
+      </w:rPr>
+    </w:lvl>
+    <w:lvl w:ilvl="1" w:tplc="440A0003" w:tentative="1">
+      <w:start w:val="1"/>
+      <w:numFmt w:val="bullet"/>
+      <w:lvlText w:val="o"/>
+      <w:lvlJc w:val="left"/>
+      <w:pPr>
+        <w:ind w:left="1440" w:hanging="360"/>
+      </w:pPr>
+      <w:rPr>
+        <w:rFonts w:ascii="Courier New" w:hAnsi="Courier New" w:cs="Courier New" w:hint="default"/>
+      </w:rPr>
+    </w:lvl>
+    <w:lvl w:ilvl="2" w:tplc="440A0005" w:tentative="1">
+      <w:start w:val="1"/>
+      <w:numFmt w:val="bullet"/>
+      <w:lvlText w:val=""/>
+      <w:lvlJc w:val="left"/>
+      <w:pPr>
+        <w:ind w:left="2160" w:hanging="360"/>
+      </w:pPr>
+      <w:rPr>
+        <w:rFonts w:ascii="Wingdings" w:hAnsi="Wingdings" w:hint="default"/>
+      </w:rPr>
+    </w:lvl>
+    <w:lvl w:ilvl="3" w:tplc="440A0001" w:tentative="1">
+      <w:start w:val="1"/>
+      <w:numFmt w:val="bullet"/>
+      <w:lvlText w:val=""/>
+      <w:lvlJc w:val="left"/>
+      <w:pPr>
+        <w:ind w:left="2880" w:hanging="360"/>
+      </w:pPr>
+      <w:rPr>
+        <w:rFonts w:ascii="Symbol" w:hAnsi="Symbol" w:hint="default"/>
+      </w:rPr>
+    </w:lvl>
+    <w:lvl w:ilvl="4" w:tplc="440A0003" w:tentative="1">
+      <w:start w:val="1"/>
+      <w:numFmt w:val="bullet"/>
+      <w:lvlText w:val="o"/>
+      <w:lvlJc w:val="left"/>
+      <w:pPr>
+        <w:ind w:left="3600" w:hanging="360"/>
+      </w:pPr>
+      <w:rPr>
+        <w:rFonts w:ascii="Courier New" w:hAnsi="Courier New" w:cs="Courier New" w:hint="default"/>
+      </w:rPr>
+    </w:lvl>
+    <w:lvl w:ilvl="5" w:tplc="440A0005" w:tentative="1">
+      <w:start w:val="1"/>
+      <w:numFmt w:val="bullet"/>
+      <w:lvlText w:val=""/>
+      <w:lvlJc w:val="left"/>
+      <w:pPr>
+        <w:ind w:left="4320" w:hanging="360"/>
+      </w:pPr>
+      <w:rPr>
+        <w:rFonts w:ascii="Wingdings" w:hAnsi="Wingdings" w:hint="default"/>
+      </w:rPr>
+    </w:lvl>
+    <w:lvl w:ilvl="6" w:tplc="440A0001" w:tentative="1">
+      <w:start w:val="1"/>
+      <w:numFmt w:val="bullet"/>
+      <w:lvlText w:val=""/>
+      <w:lvlJc w:val="left"/>
+      <w:pPr>
+        <w:ind w:left="5040" w:hanging="360"/>
+      </w:pPr>
+      <w:rPr>
+        <w:rFonts w:ascii="Symbol" w:hAnsi="Symbol" w:hint="default"/>
+      </w:rPr>
+    </w:lvl>
+    <w:lvl w:ilvl="7" w:tplc="440A0003" w:tentative="1">
+      <w:start w:val="1"/>
+      <w:numFmt w:val="bullet"/>
+      <w:lvlText w:val="o"/>
+      <w:lvlJc w:val="left"/>
+      <w:pPr>
+        <w:ind w:left="5760" w:hanging="360"/>
+      </w:pPr>
+      <w:rPr>
+        <w:rFonts w:ascii="Courier New" w:hAnsi="Courier New" w:cs="Courier New" w:hint="default"/>
+      </w:rPr>
+    </w:lvl>
+    <w:lvl w:ilvl="8" w:tplc="440A0005" w:tentative="1">
+      <w:start w:val="1"/>
+      <w:numFmt w:val="bullet"/>
+      <w:lvlText w:val=""/>
+      <w:lvlJc w:val="left"/>
+      <w:pPr>
+        <w:ind w:left="6480" w:hanging="360"/>
+      </w:pPr>
+      <w:rPr>
+        <w:rFonts w:ascii="Wingdings" w:hAnsi="Wingdings" w:hint="default"/>
+      </w:rPr>
+    </w:lvl>
+  </w:abstractNum>
+  <w:abstractNum w:abstractNumId="4" w15:restartNumberingAfterBreak="0">
+    <w:nsid w:val="1F50066F"/>
+    <w:multiLevelType w:val="hybridMultilevel"/>
+    <w:tmpl w:val="1212B504"/>
+    <w:lvl w:ilvl="0" w:tplc="440A0001">
+      <w:start w:val="1"/>
+      <w:numFmt w:val="bullet"/>
+      <w:lvlText w:val=""/>
+      <w:lvlJc w:val="left"/>
+      <w:pPr>
+        <w:ind w:left="720" w:hanging="360"/>
+      </w:pPr>
+      <w:rPr>
+        <w:rFonts w:ascii="Symbol" w:hAnsi="Symbol" w:hint="default"/>
+      </w:rPr>
+    </w:lvl>
+    <w:lvl w:ilvl="1" w:tplc="440A0003" w:tentative="1">
+      <w:start w:val="1"/>
+      <w:numFmt w:val="bullet"/>
+      <w:lvlText w:val="o"/>
+      <w:lvlJc w:val="left"/>
+      <w:pPr>
+        <w:ind w:left="1440" w:hanging="360"/>
+      </w:pPr>
+      <w:rPr>
+        <w:rFonts w:ascii="Courier New" w:hAnsi="Courier New" w:cs="Courier New" w:hint="default"/>
+      </w:rPr>
+    </w:lvl>
+    <w:lvl w:ilvl="2" w:tplc="440A0005" w:tentative="1">
+      <w:start w:val="1"/>
+      <w:numFmt w:val="bullet"/>
+      <w:lvlText w:val=""/>
+      <w:lvlJc w:val="left"/>
+      <w:pPr>
+        <w:ind w:left="2160" w:hanging="360"/>
+      </w:pPr>
+      <w:rPr>
+        <w:rFonts w:ascii="Wingdings" w:hAnsi="Wingdings" w:hint="default"/>
+      </w:rPr>
+    </w:lvl>
+    <w:lvl w:ilvl="3" w:tplc="440A0001" w:tentative="1">
+      <w:start w:val="1"/>
+      <w:numFmt w:val="bullet"/>
+      <w:lvlText w:val=""/>
+      <w:lvlJc w:val="left"/>
+      <w:pPr>
+        <w:ind w:left="2880" w:hanging="360"/>
+      </w:pPr>
+      <w:rPr>
+        <w:rFonts w:ascii="Symbol" w:hAnsi="Symbol" w:hint="default"/>
+      </w:rPr>
+    </w:lvl>
+    <w:lvl w:ilvl="4" w:tplc="440A0003" w:tentative="1">
+      <w:start w:val="1"/>
+      <w:numFmt w:val="bullet"/>
+      <w:lvlText w:val="o"/>
+      <w:lvlJc w:val="left"/>
+      <w:pPr>
+        <w:ind w:left="3600" w:hanging="360"/>
+      </w:pPr>
+      <w:rPr>
+        <w:rFonts w:ascii="Courier New" w:hAnsi="Courier New" w:cs="Courier New" w:hint="default"/>
+      </w:rPr>
+    </w:lvl>
+    <w:lvl w:ilvl="5" w:tplc="440A0005" w:tentative="1">
+      <w:start w:val="1"/>
+      <w:numFmt w:val="bullet"/>
+      <w:lvlText w:val=""/>
+      <w:lvlJc w:val="left"/>
+      <w:pPr>
+        <w:ind w:left="4320" w:hanging="360"/>
+      </w:pPr>
+      <w:rPr>
+        <w:rFonts w:ascii="Wingdings" w:hAnsi="Wingdings" w:hint="default"/>
+      </w:rPr>
+    </w:lvl>
+    <w:lvl w:ilvl="6" w:tplc="440A0001" w:tentative="1">
+      <w:start w:val="1"/>
+      <w:numFmt w:val="bullet"/>
+      <w:lvlText w:val=""/>
+      <w:lvlJc w:val="left"/>
+      <w:pPr>
+        <w:ind w:left="5040" w:hanging="360"/>
+      </w:pPr>
+      <w:rPr>
+        <w:rFonts w:ascii="Symbol" w:hAnsi="Symbol" w:hint="default"/>
+      </w:rPr>
+    </w:lvl>
+    <w:lvl w:ilvl="7" w:tplc="440A0003" w:tentative="1">
+      <w:start w:val="1"/>
+      <w:numFmt w:val="bullet"/>
+      <w:lvlText w:val="o"/>
+      <w:lvlJc w:val="left"/>
+      <w:pPr>
+        <w:ind w:left="5760" w:hanging="360"/>
+      </w:pPr>
+      <w:rPr>
+        <w:rFonts w:ascii="Courier New" w:hAnsi="Courier New" w:cs="Courier New" w:hint="default"/>
+      </w:rPr>
+    </w:lvl>
+    <w:lvl w:ilvl="8" w:tplc="440A0005" w:tentative="1">
+      <w:start w:val="1"/>
+      <w:numFmt w:val="bullet"/>
+      <w:lvlText w:val=""/>
+      <w:lvlJc w:val="left"/>
+      <w:pPr>
+        <w:ind w:left="6480" w:hanging="360"/>
+      </w:pPr>
+      <w:rPr>
+        <w:rFonts w:ascii="Wingdings" w:hAnsi="Wingdings" w:hint="default"/>
+      </w:rPr>
+    </w:lvl>
+  </w:abstractNum>
+  <w:abstractNum w:abstractNumId="5" w15:restartNumberingAfterBreak="0">
     <w:nsid w:val="1FD02780"/>
     <w:multiLevelType w:val="hybridMultilevel"/>
     <w:tmpl w:val="22709102"/>
@@ -1660,7 +2681,7 @@
       </w:rPr>
     </w:lvl>
   </w:abstractNum>
-  <w:abstractNum w:abstractNumId="4" w15:restartNumberingAfterBreak="0">
+  <w:abstractNum w:abstractNumId="6" w15:restartNumberingAfterBreak="0">
     <w:nsid w:val="2519687B"/>
     <w:multiLevelType w:val="multilevel"/>
     <w:tmpl w:val="23CA5E78"/>
@@ -1809,7 +2830,120 @@
       </w:rPr>
     </w:lvl>
   </w:abstractNum>
-  <w:abstractNum w:abstractNumId="5" w15:restartNumberingAfterBreak="0">
+  <w:abstractNum w:abstractNumId="7" w15:restartNumberingAfterBreak="0">
+    <w:nsid w:val="2BA21F7D"/>
+    <w:multiLevelType w:val="hybridMultilevel"/>
+    <w:tmpl w:val="8A4AE072"/>
+    <w:lvl w:ilvl="0" w:tplc="440A0001">
+      <w:start w:val="1"/>
+      <w:numFmt w:val="bullet"/>
+      <w:lvlText w:val=""/>
+      <w:lvlJc w:val="left"/>
+      <w:pPr>
+        <w:ind w:left="720" w:hanging="360"/>
+      </w:pPr>
+      <w:rPr>
+        <w:rFonts w:ascii="Symbol" w:hAnsi="Symbol" w:hint="default"/>
+      </w:rPr>
+    </w:lvl>
+    <w:lvl w:ilvl="1" w:tplc="440A0003" w:tentative="1">
+      <w:start w:val="1"/>
+      <w:numFmt w:val="bullet"/>
+      <w:lvlText w:val="o"/>
+      <w:lvlJc w:val="left"/>
+      <w:pPr>
+        <w:ind w:left="1440" w:hanging="360"/>
+      </w:pPr>
+      <w:rPr>
+        <w:rFonts w:ascii="Courier New" w:hAnsi="Courier New" w:cs="Courier New" w:hint="default"/>
+      </w:rPr>
+    </w:lvl>
+    <w:lvl w:ilvl="2" w:tplc="440A0005" w:tentative="1">
+      <w:start w:val="1"/>
+      <w:numFmt w:val="bullet"/>
+      <w:lvlText w:val=""/>
+      <w:lvlJc w:val="left"/>
+      <w:pPr>
+        <w:ind w:left="2160" w:hanging="360"/>
+      </w:pPr>
+      <w:rPr>
+        <w:rFonts w:ascii="Wingdings" w:hAnsi="Wingdings" w:hint="default"/>
+      </w:rPr>
+    </w:lvl>
+    <w:lvl w:ilvl="3" w:tplc="440A0001" w:tentative="1">
+      <w:start w:val="1"/>
+      <w:numFmt w:val="bullet"/>
+      <w:lvlText w:val=""/>
+      <w:lvlJc w:val="left"/>
+      <w:pPr>
+        <w:ind w:left="2880" w:hanging="360"/>
+      </w:pPr>
+      <w:rPr>
+        <w:rFonts w:ascii="Symbol" w:hAnsi="Symbol" w:hint="default"/>
+      </w:rPr>
+    </w:lvl>
+    <w:lvl w:ilvl="4" w:tplc="440A0003" w:tentative="1">
+      <w:start w:val="1"/>
+      <w:numFmt w:val="bullet"/>
+      <w:lvlText w:val="o"/>
+      <w:lvlJc w:val="left"/>
+      <w:pPr>
+        <w:ind w:left="3600" w:hanging="360"/>
+      </w:pPr>
+      <w:rPr>
+        <w:rFonts w:ascii="Courier New" w:hAnsi="Courier New" w:cs="Courier New" w:hint="default"/>
+      </w:rPr>
+    </w:lvl>
+    <w:lvl w:ilvl="5" w:tplc="440A0005" w:tentative="1">
+      <w:start w:val="1"/>
+      <w:numFmt w:val="bullet"/>
+      <w:lvlText w:val=""/>
+      <w:lvlJc w:val="left"/>
+      <w:pPr>
+        <w:ind w:left="4320" w:hanging="360"/>
+      </w:pPr>
+      <w:rPr>
+        <w:rFonts w:ascii="Wingdings" w:hAnsi="Wingdings" w:hint="default"/>
+      </w:rPr>
+    </w:lvl>
+    <w:lvl w:ilvl="6" w:tplc="440A0001" w:tentative="1">
+      <w:start w:val="1"/>
+      <w:numFmt w:val="bullet"/>
+      <w:lvlText w:val=""/>
+      <w:lvlJc w:val="left"/>
+      <w:pPr>
+        <w:ind w:left="5040" w:hanging="360"/>
+      </w:pPr>
+      <w:rPr>
+        <w:rFonts w:ascii="Symbol" w:hAnsi="Symbol" w:hint="default"/>
+      </w:rPr>
+    </w:lvl>
+    <w:lvl w:ilvl="7" w:tplc="440A0003" w:tentative="1">
+      <w:start w:val="1"/>
+      <w:numFmt w:val="bullet"/>
+      <w:lvlText w:val="o"/>
+      <w:lvlJc w:val="left"/>
+      <w:pPr>
+        <w:ind w:left="5760" w:hanging="360"/>
+      </w:pPr>
+      <w:rPr>
+        <w:rFonts w:ascii="Courier New" w:hAnsi="Courier New" w:cs="Courier New" w:hint="default"/>
+      </w:rPr>
+    </w:lvl>
+    <w:lvl w:ilvl="8" w:tplc="440A0005" w:tentative="1">
+      <w:start w:val="1"/>
+      <w:numFmt w:val="bullet"/>
+      <w:lvlText w:val=""/>
+      <w:lvlJc w:val="left"/>
+      <w:pPr>
+        <w:ind w:left="6480" w:hanging="360"/>
+      </w:pPr>
+      <w:rPr>
+        <w:rFonts w:ascii="Wingdings" w:hAnsi="Wingdings" w:hint="default"/>
+      </w:rPr>
+    </w:lvl>
+  </w:abstractNum>
+  <w:abstractNum w:abstractNumId="8" w15:restartNumberingAfterBreak="0">
     <w:nsid w:val="3040513F"/>
     <w:multiLevelType w:val="multilevel"/>
     <w:tmpl w:val="4E1E335C"/>
@@ -1958,7 +3092,7 @@
       </w:rPr>
     </w:lvl>
   </w:abstractNum>
-  <w:abstractNum w:abstractNumId="6" w15:restartNumberingAfterBreak="0">
+  <w:abstractNum w:abstractNumId="9" w15:restartNumberingAfterBreak="0">
     <w:nsid w:val="363C64F1"/>
     <w:multiLevelType w:val="multilevel"/>
     <w:tmpl w:val="8F4A7694"/>
@@ -2107,7 +3241,7 @@
       </w:rPr>
     </w:lvl>
   </w:abstractNum>
-  <w:abstractNum w:abstractNumId="7" w15:restartNumberingAfterBreak="0">
+  <w:abstractNum w:abstractNumId="10" w15:restartNumberingAfterBreak="0">
     <w:nsid w:val="3AE8161E"/>
     <w:multiLevelType w:val="multilevel"/>
     <w:tmpl w:val="655E33E2"/>
@@ -2256,7 +3390,7 @@
       </w:rPr>
     </w:lvl>
   </w:abstractNum>
-  <w:abstractNum w:abstractNumId="8" w15:restartNumberingAfterBreak="0">
+  <w:abstractNum w:abstractNumId="11" w15:restartNumberingAfterBreak="0">
     <w:nsid w:val="4B077E2A"/>
     <w:multiLevelType w:val="multilevel"/>
     <w:tmpl w:val="B2E451FE"/>
@@ -2405,7 +3539,7 @@
       </w:rPr>
     </w:lvl>
   </w:abstractNum>
-  <w:abstractNum w:abstractNumId="9" w15:restartNumberingAfterBreak="0">
+  <w:abstractNum w:abstractNumId="12" w15:restartNumberingAfterBreak="0">
     <w:nsid w:val="605273DB"/>
     <w:multiLevelType w:val="multilevel"/>
     <w:tmpl w:val="EE9EE85C"/>
@@ -2554,7 +3688,7 @@
       </w:rPr>
     </w:lvl>
   </w:abstractNum>
-  <w:abstractNum w:abstractNumId="10" w15:restartNumberingAfterBreak="0">
+  <w:abstractNum w:abstractNumId="13" w15:restartNumberingAfterBreak="0">
     <w:nsid w:val="6B951066"/>
     <w:multiLevelType w:val="multilevel"/>
     <w:tmpl w:val="8232616A"/>
@@ -2703,7 +3837,7 @@
       </w:rPr>
     </w:lvl>
   </w:abstractNum>
-  <w:abstractNum w:abstractNumId="11" w15:restartNumberingAfterBreak="0">
+  <w:abstractNum w:abstractNumId="14" w15:restartNumberingAfterBreak="0">
     <w:nsid w:val="724476A0"/>
     <w:multiLevelType w:val="multilevel"/>
     <w:tmpl w:val="31AE67F6"/>
@@ -2852,7 +3986,7 @@
       </w:rPr>
     </w:lvl>
   </w:abstractNum>
-  <w:abstractNum w:abstractNumId="12" w15:restartNumberingAfterBreak="0">
+  <w:abstractNum w:abstractNumId="15" w15:restartNumberingAfterBreak="0">
     <w:nsid w:val="79F16FDD"/>
     <w:multiLevelType w:val="multilevel"/>
     <w:tmpl w:val="7FE03F74"/>
@@ -3002,43 +4136,52 @@
     </w:lvl>
   </w:abstractNum>
   <w:num w:numId="1" w16cid:durableId="1492984316">
-    <w:abstractNumId w:val="7"/>
+    <w:abstractNumId w:val="10"/>
   </w:num>
   <w:num w:numId="2" w16cid:durableId="869728568">
     <w:abstractNumId w:val="1"/>
   </w:num>
   <w:num w:numId="3" w16cid:durableId="1433748183">
-    <w:abstractNumId w:val="10"/>
+    <w:abstractNumId w:val="13"/>
   </w:num>
   <w:num w:numId="4" w16cid:durableId="1229072388">
-    <w:abstractNumId w:val="12"/>
+    <w:abstractNumId w:val="15"/>
   </w:num>
   <w:num w:numId="5" w16cid:durableId="1996295867">
-    <w:abstractNumId w:val="8"/>
+    <w:abstractNumId w:val="11"/>
   </w:num>
   <w:num w:numId="6" w16cid:durableId="1677610832">
-    <w:abstractNumId w:val="9"/>
+    <w:abstractNumId w:val="12"/>
   </w:num>
   <w:num w:numId="7" w16cid:durableId="984159764">
     <w:abstractNumId w:val="2"/>
   </w:num>
   <w:num w:numId="8" w16cid:durableId="1452282834">
-    <w:abstractNumId w:val="5"/>
+    <w:abstractNumId w:val="8"/>
   </w:num>
   <w:num w:numId="9" w16cid:durableId="1395397423">
-    <w:abstractNumId w:val="4"/>
+    <w:abstractNumId w:val="6"/>
   </w:num>
   <w:num w:numId="10" w16cid:durableId="1254314425">
-    <w:abstractNumId w:val="6"/>
+    <w:abstractNumId w:val="9"/>
   </w:num>
   <w:num w:numId="11" w16cid:durableId="1691254675">
-    <w:abstractNumId w:val="11"/>
+    <w:abstractNumId w:val="14"/>
   </w:num>
   <w:num w:numId="12" w16cid:durableId="17898657">
     <w:abstractNumId w:val="0"/>
   </w:num>
   <w:num w:numId="13" w16cid:durableId="892235610">
+    <w:abstractNumId w:val="5"/>
+  </w:num>
+  <w:num w:numId="14" w16cid:durableId="1453012259">
+    <w:abstractNumId w:val="7"/>
+  </w:num>
+  <w:num w:numId="15" w16cid:durableId="1502043135">
     <w:abstractNumId w:val="3"/>
+  </w:num>
+  <w:num w:numId="16" w16cid:durableId="1188762301">
+    <w:abstractNumId w:val="4"/>
   </w:num>
 </w:numbering>
 </file>

</xml_diff>

<commit_message>
feat(alpha): BACKUP VISTA CONTRATISTA SIN PERFIL 14/11/2025 00:05
</commit_message>
<xml_diff>
--- a/Contexto del progreso.docx
+++ b/Contexto del progreso.docx
@@ -1882,34 +1882,891 @@
     <w:p/>
     <w:p>
       <w:r>
+        <w:rPr>
+          <w:b/>
+          <w:bCs/>
+        </w:rPr>
+        <w:t>Parte 15: Refinamiento de "Editar Perfil" (Gestión de Habilidades)</w:t>
+      </w:r>
+      <w:r>
+        <w:t xml:space="preserve"> </w:t>
+      </w:r>
+    </w:p>
+    <w:p>
+      <w:pPr>
+        <w:pStyle w:val="Prrafodelista"/>
+        <w:numPr>
+          <w:ilvl w:val="0"/>
+          <w:numId w:val="17"/>
+        </w:numPr>
+      </w:pPr>
+      <w:r>
+        <w:t xml:space="preserve">[X] Creamos los íconos ic_close_chip.xml (para eliminar) y ic_add_chip.xml (para añadir). </w:t>
+      </w:r>
+    </w:p>
+    <w:p>
+      <w:pPr>
+        <w:pStyle w:val="Prrafodelista"/>
+        <w:numPr>
+          <w:ilvl w:val="0"/>
+          <w:numId w:val="17"/>
+        </w:numPr>
+      </w:pPr>
+      <w:r>
+        <w:t xml:space="preserve">[X] Creamos el layout item_habilidad_editable.xml (el "chip" con el botón "X"). [X] Actualizamos activity_editar_perfil.xml para añadir un RecyclerView (recyclerHabilidadesEdit) y un formulario para "Añadir Habilidad". </w:t>
+      </w:r>
+    </w:p>
+    <w:p>
+      <w:pPr>
+        <w:pStyle w:val="Prrafodelista"/>
+        <w:numPr>
+          <w:ilvl w:val="0"/>
+          <w:numId w:val="17"/>
+        </w:numPr>
+      </w:pPr>
+      <w:r>
+        <w:t xml:space="preserve">[X] Creamos el HabilidadEditableAdapter.java, que incluye una interfaz OnHabilidadListener para notificar a la </w:t>
+      </w:r>
+      <w:r>
+        <w:rPr>
+          <w:i/>
+          <w:iCs/>
+        </w:rPr>
+        <w:t>activity</w:t>
+      </w:r>
+      <w:r>
+        <w:t xml:space="preserve"> sobre los clics de eliminación. </w:t>
+      </w:r>
+    </w:p>
+    <w:p>
+      <w:pPr>
+        <w:pStyle w:val="Prrafodelista"/>
+        <w:numPr>
+          <w:ilvl w:val="0"/>
+          <w:numId w:val="17"/>
+        </w:numPr>
+      </w:pPr>
+      <w:r>
+        <w:t xml:space="preserve">[X] Corregimos Habilidad.java añadiendo un constructor vacío (public Habilidad() {}) para solucionar el </w:t>
+      </w:r>
+      <w:r>
+        <w:rPr>
+          <w:i/>
+          <w:iCs/>
+        </w:rPr>
+        <w:t>crash</w:t>
+      </w:r>
+      <w:r>
+        <w:t xml:space="preserve"> Expected 2 arguments but found 0. </w:t>
+      </w:r>
+    </w:p>
+    <w:p>
+      <w:pPr>
+        <w:pStyle w:val="Prrafodelista"/>
+        <w:numPr>
+          <w:ilvl w:val="0"/>
+          <w:numId w:val="17"/>
+        </w:numPr>
+      </w:pPr>
+      <w:r>
+        <w:t xml:space="preserve">[X] Actualizamos EditarPerfilActivity.java para: </w:t>
+      </w:r>
+    </w:p>
+    <w:p>
+      <w:pPr>
+        <w:pStyle w:val="Prrafodelista"/>
+        <w:numPr>
+          <w:ilvl w:val="0"/>
+          <w:numId w:val="17"/>
+        </w:numPr>
+      </w:pPr>
+      <w:r>
+        <w:t xml:space="preserve">[X] Implementar la interfaz OnHabilidadListener. </w:t>
+      </w:r>
+    </w:p>
+    <w:p>
+      <w:pPr>
+        <w:pStyle w:val="Prrafodelista"/>
+        <w:numPr>
+          <w:ilvl w:val="0"/>
+          <w:numId w:val="17"/>
+        </w:numPr>
+      </w:pPr>
+      <w:r>
+        <w:t xml:space="preserve">[X] Poblar el RecyclerView con las habilidades cargadas del perfil. </w:t>
+      </w:r>
+    </w:p>
+    <w:p>
+      <w:pPr>
+        <w:pStyle w:val="Prrafodelista"/>
+        <w:numPr>
+          <w:ilvl w:val="0"/>
+          <w:numId w:val="17"/>
+        </w:numPr>
+      </w:pPr>
+      <w:r>
+        <w:t xml:space="preserve">[X] Implementar la lógica anadirHabilidad() y onHabilidadEliminarClick() para modificar la lista de habilidades localmente. </w:t>
+      </w:r>
+    </w:p>
+    <w:p>
+      <w:pPr>
+        <w:pStyle w:val="Prrafodelista"/>
+        <w:numPr>
+          <w:ilvl w:val="0"/>
+          <w:numId w:val="17"/>
+        </w:numPr>
+      </w:pPr>
+      <w:r>
+        <w:t xml:space="preserve">[X] Actualizamos guardarCambios() para que envíe la lista de habilidades actualizada a la API. </w:t>
+      </w:r>
+    </w:p>
+    <w:p>
+      <w:pPr>
+        <w:pStyle w:val="Prrafodelista"/>
+        <w:numPr>
+          <w:ilvl w:val="0"/>
+          <w:numId w:val="17"/>
+        </w:numPr>
+      </w:pPr>
+      <w:r>
+        <w:t xml:space="preserve">[X] Actualizamos actualizarMiPerfil.php para que use una </w:t>
+      </w:r>
+      <w:r>
+        <w:rPr>
+          <w:b/>
+          <w:bCs/>
+        </w:rPr>
+        <w:t>transacción</w:t>
+      </w:r>
+      <w:r>
+        <w:t xml:space="preserve"> (beginTransaction, commit, rollBack): </w:t>
+      </w:r>
+    </w:p>
+    <w:p>
+      <w:pPr>
+        <w:pStyle w:val="Prrafodelista"/>
+        <w:numPr>
+          <w:ilvl w:val="0"/>
+          <w:numId w:val="17"/>
+        </w:numPr>
+      </w:pPr>
+      <w:r>
+        <w:t xml:space="preserve">[X] El script ahora borra (DELETE) todas las entradas de habilidad_estudiante para ese usuario. </w:t>
+      </w:r>
+    </w:p>
+    <w:p>
+      <w:pPr>
+        <w:pStyle w:val="Prrafodelista"/>
+        <w:numPr>
+          <w:ilvl w:val="0"/>
+          <w:numId w:val="17"/>
+        </w:numPr>
+      </w:pPr>
+      <w:r>
+        <w:t xml:space="preserve">[X] Luego, recorre el nuevo </w:t>
+      </w:r>
+      <w:r>
+        <w:rPr>
+          <w:i/>
+          <w:iCs/>
+        </w:rPr>
+        <w:t>array</w:t>
+      </w:r>
+      <w:r>
+        <w:t xml:space="preserve"> de habilidades, busca o crea cada habilidad, y vuelve a insertar las nuevas relaciones en habilidad_estudiante.</w:t>
+      </w:r>
+    </w:p>
+    <w:p>
+      <w:r>
+        <w:rPr>
+          <w:b/>
+          <w:bCs/>
+        </w:rPr>
+        <w:t>Parte 16: Refinamiento de "Editar Perfil" (Gestión de Educación)</w:t>
+      </w:r>
+      <w:r>
+        <w:t xml:space="preserve"> </w:t>
+      </w:r>
+    </w:p>
+    <w:p>
+      <w:pPr>
+        <w:pStyle w:val="Prrafodelista"/>
+        <w:numPr>
+          <w:ilvl w:val="0"/>
+          <w:numId w:val="18"/>
+        </w:numPr>
+      </w:pPr>
+      <w:r>
+        <w:t xml:space="preserve">[X] Creamos el script getUniversidades.php para obtener la lista completa de universidades de la tabla universidad. </w:t>
+      </w:r>
+    </w:p>
+    <w:p>
+      <w:pPr>
+        <w:pStyle w:val="Prrafodelista"/>
+        <w:numPr>
+          <w:ilvl w:val="0"/>
+          <w:numId w:val="18"/>
+        </w:numPr>
+      </w:pPr>
+      <w:r>
+        <w:lastRenderedPageBreak/>
+        <w:t xml:space="preserve">[X] Actualizamos ApiService.java con el nuevo </w:t>
+      </w:r>
+      <w:r>
+        <w:rPr>
+          <w:i/>
+          <w:iCs/>
+        </w:rPr>
+        <w:t>endpoint</w:t>
+      </w:r>
+      <w:r>
+        <w:t xml:space="preserve"> getUniversidades(token). </w:t>
+      </w:r>
+    </w:p>
+    <w:p>
+      <w:pPr>
+        <w:pStyle w:val="Prrafodelista"/>
+        <w:numPr>
+          <w:ilvl w:val="0"/>
+          <w:numId w:val="18"/>
+        </w:numPr>
+      </w:pPr>
+      <w:r>
+        <w:t xml:space="preserve">[X] Creamos el layout item_universidad_editable.xml (la fila con el logo y el botón "X"). </w:t>
+      </w:r>
+    </w:p>
+    <w:p>
+      <w:pPr>
+        <w:pStyle w:val="Prrafodelista"/>
+        <w:numPr>
+          <w:ilvl w:val="0"/>
+          <w:numId w:val="18"/>
+        </w:numPr>
+      </w:pPr>
+      <w:r>
+        <w:t xml:space="preserve">[X] Creamos el UniversidadEditableAdapter.java (con lógica de decodificación de logo Base64 y una interfaz OnUniversidadListener). </w:t>
+      </w:r>
+    </w:p>
+    <w:p>
+      <w:pPr>
+        <w:pStyle w:val="Prrafodelista"/>
+        <w:numPr>
+          <w:ilvl w:val="0"/>
+          <w:numId w:val="18"/>
+        </w:numPr>
+      </w:pPr>
+      <w:r>
+        <w:t xml:space="preserve">[X] Actualizamos activity_editar_perfil.xml para añadir la sección "Gestionar Educación", incluyendo un RecyclerView (recyclerUniversidadesEdit) y un AutoCompleteTextView (spinner) para añadir nuevas universidades. </w:t>
+      </w:r>
+    </w:p>
+    <w:p>
+      <w:pPr>
+        <w:pStyle w:val="Prrafodelista"/>
+        <w:numPr>
+          <w:ilvl w:val="0"/>
+          <w:numId w:val="18"/>
+        </w:numPr>
+      </w:pPr>
+      <w:r>
+        <w:t xml:space="preserve">[X] Actualizamos EditarPerfilActivity.java para: </w:t>
+      </w:r>
+    </w:p>
+    <w:p>
+      <w:pPr>
+        <w:pStyle w:val="Prrafodelista"/>
+        <w:numPr>
+          <w:ilvl w:val="0"/>
+          <w:numId w:val="18"/>
+        </w:numPr>
+      </w:pPr>
+      <w:r>
+        <w:t xml:space="preserve">[X] Implementar la interfaz OnUniversidadListener. </w:t>
+      </w:r>
+    </w:p>
+    <w:p>
+      <w:pPr>
+        <w:pStyle w:val="Prrafodelista"/>
+        <w:numPr>
+          <w:ilvl w:val="0"/>
+          <w:numId w:val="18"/>
+        </w:numPr>
+      </w:pPr>
+      <w:r>
+        <w:t xml:space="preserve">[X] Llamar a getUniversidades.php para poblar el </w:t>
+      </w:r>
+      <w:r>
+        <w:rPr>
+          <w:i/>
+          <w:iCs/>
+        </w:rPr>
+        <w:t>spinner</w:t>
+      </w:r>
+      <w:r>
+        <w:t xml:space="preserve"> de "Añadir". </w:t>
+      </w:r>
+    </w:p>
+    <w:p>
+      <w:pPr>
+        <w:pStyle w:val="Prrafodelista"/>
+        <w:numPr>
+          <w:ilvl w:val="0"/>
+          <w:numId w:val="18"/>
+        </w:numPr>
+      </w:pPr>
+      <w:r>
+        <w:t xml:space="preserve">[X] Poblar el RecyclerView con las universidades actuales del estudiante. </w:t>
+      </w:r>
+    </w:p>
+    <w:p>
+      <w:pPr>
+        <w:pStyle w:val="Prrafodelista"/>
+        <w:numPr>
+          <w:ilvl w:val="0"/>
+          <w:numId w:val="18"/>
+        </w:numPr>
+      </w:pPr>
+      <w:r>
+        <w:t xml:space="preserve">[X] Implementar la lógica anadirUniversidad() y onUniversidadEliminarClick() para modificar la lista local. </w:t>
+      </w:r>
+    </w:p>
+    <w:p>
+      <w:pPr>
+        <w:pStyle w:val="Prrafodelista"/>
+        <w:numPr>
+          <w:ilvl w:val="0"/>
+          <w:numId w:val="18"/>
+        </w:numPr>
+      </w:pPr>
+      <w:r>
+        <w:t xml:space="preserve">[X] Actualizar guardarCambios() para que envíe la lista universidades actualizada a la API. </w:t>
+      </w:r>
+    </w:p>
+    <w:p>
+      <w:pPr>
+        <w:pStyle w:val="Prrafodelista"/>
+        <w:numPr>
+          <w:ilvl w:val="0"/>
+          <w:numId w:val="18"/>
+        </w:numPr>
+      </w:pPr>
+      <w:r>
+        <w:t xml:space="preserve">[X] Actualizamos actualizarMiPerfil.php para que sincronice la tabla estudiante_universidad (borrando las viejas e insertando las nuevas) dentro de la misma transacción. </w:t>
+      </w:r>
+    </w:p>
+    <w:p>
+      <w:pPr>
+        <w:pStyle w:val="Prrafodelista"/>
+        <w:numPr>
+          <w:ilvl w:val="0"/>
+          <w:numId w:val="18"/>
+        </w:numPr>
+      </w:pPr>
+      <w:r>
+        <w:t xml:space="preserve">[X] </w:t>
+      </w:r>
+      <w:r>
+        <w:rPr>
+          <w:b/>
+          <w:bCs/>
+        </w:rPr>
+        <w:t>Fase de Depuración de Edición:</w:t>
+      </w:r>
+      <w:r>
+        <w:t xml:space="preserve"> </w:t>
+      </w:r>
+    </w:p>
+    <w:p>
+      <w:pPr>
+        <w:pStyle w:val="Prrafodelista"/>
+        <w:numPr>
+          <w:ilvl w:val="0"/>
+          <w:numId w:val="18"/>
+        </w:numPr>
+      </w:pPr>
+      <w:r>
+        <w:t xml:space="preserve">[X] Corregimos el </w:t>
+      </w:r>
+      <w:r>
+        <w:rPr>
+          <w:i/>
+          <w:iCs/>
+        </w:rPr>
+        <w:t>bug</w:t>
+      </w:r>
+      <w:r>
+        <w:t xml:space="preserve"> donde anio_carrera y portafolio_url se guardaban como NULL. </w:t>
+      </w:r>
+    </w:p>
+    <w:p>
+      <w:pPr>
+        <w:pStyle w:val="Prrafodelista"/>
+        <w:numPr>
+          <w:ilvl w:val="0"/>
+          <w:numId w:val="18"/>
+        </w:numPr>
+      </w:pPr>
+      <w:r>
+        <w:t xml:space="preserve">[X] </w:t>
+      </w:r>
+      <w:r>
+        <w:rPr>
+          <w:b/>
+          <w:bCs/>
+        </w:rPr>
+        <w:t>Solución:</w:t>
+      </w:r>
+      <w:r>
+        <w:t xml:space="preserve"> Corregimos el desajuste de camelCase vs. snake_case en actualizarMiPerfil.php (cambiando $data-&gt;anioCarrera por $data-&gt;anio_carrera). </w:t>
+      </w:r>
+    </w:p>
+    <w:p>
+      <w:pPr>
+        <w:pStyle w:val="Prrafodelista"/>
+        <w:numPr>
+          <w:ilvl w:val="0"/>
+          <w:numId w:val="18"/>
+        </w:numPr>
+      </w:pPr>
+      <w:r>
+        <w:t xml:space="preserve">[X] Corregimos el </w:t>
+      </w:r>
+      <w:r>
+        <w:rPr>
+          <w:i/>
+          <w:iCs/>
+        </w:rPr>
+        <w:t>bug</w:t>
+      </w:r>
+      <w:r>
+        <w:t xml:space="preserve"> donde las universidades añadidas no se guardaban. </w:t>
+      </w:r>
+    </w:p>
+    <w:p>
+      <w:pPr>
+        <w:pStyle w:val="Prrafodelista"/>
+        <w:numPr>
+          <w:ilvl w:val="0"/>
+          <w:numId w:val="18"/>
+        </w:numPr>
+      </w:pPr>
+      <w:r>
+        <w:t xml:space="preserve">[X] </w:t>
+      </w:r>
+      <w:r>
+        <w:rPr>
+          <w:b/>
+          <w:bCs/>
+        </w:rPr>
+        <w:t>Solución:</w:t>
+      </w:r>
+      <w:r>
+        <w:t xml:space="preserve"> Corregimos el desajuste en actualizarMiPerfil.php (cambiando $uni_obj-&gt;idUniversidad por $uni_obj-&gt;id_universidad) para coincidir con la anotación @SerializedName del POJO Universidad.java.</w:t>
+      </w:r>
+    </w:p>
+    <w:p/>
+    <w:p>
+      <w:r>
+        <w:rPr>
+          <w:b/>
+          <w:bCs/>
+        </w:rPr>
+        <w:t>Parte 13: Redirección de Login por Tipo de Usuario (El "Router")</w:t>
+      </w:r>
+      <w:r>
+        <w:t xml:space="preserve"> </w:t>
+      </w:r>
+    </w:p>
+    <w:p>
+      <w:r>
+        <w:t xml:space="preserve">[X] Actualizamos SessionManager.java para añadir los métodos saveSession() (actualizado), getUserType() y isLoggedIn(), para guardar y leer el tipo de usuario. [X] Actualizamos LoginActivity.java para: </w:t>
+      </w:r>
+    </w:p>
+    <w:p>
+      <w:r>
+        <w:lastRenderedPageBreak/>
+        <w:t xml:space="preserve">[X] Comprobar el tipo de usuario en onCreate() para redirigir automáticamente si ya hay una sesión activa. </w:t>
+      </w:r>
+    </w:p>
+    <w:p>
+      <w:r>
+        <w:t xml:space="preserve">[X] En el onResponse de apiService.login(), leer el userType del objeto Usuario. [X] Guardar el userType en el SessionManager. </w:t>
+      </w:r>
+    </w:p>
+    <w:p>
+      <w:r>
+        <w:t>[X] Implementar un if/else para redirigir a MainActivity si es "estudiante" o a ContratistaDashboardActivity si es "contratista".</w:t>
+      </w:r>
+    </w:p>
+    <w:p>
+      <w:r>
+        <w:rPr>
+          <w:b/>
+          <w:bCs/>
+        </w:rPr>
+        <w:t>Parte 14: Dashboard del Contratista (Estadísticas y Proyectos)</w:t>
+      </w:r>
+      <w:r>
+        <w:t xml:space="preserve"> </w:t>
+      </w:r>
+    </w:p>
+    <w:p>
+      <w:r>
+        <w:t xml:space="preserve">[X] Creamos el POJO ContratistaStats.java (para las tarjetas de estadísticas). </w:t>
+      </w:r>
+    </w:p>
+    <w:p>
+      <w:r>
+        <w:t xml:space="preserve">[X] Creamos el layout item_proyecto_contratista.xml (la tarjeta para la lista "Proyectos Recientes"). </w:t>
+      </w:r>
+    </w:p>
+    <w:p>
+      <w:r>
+        <w:t xml:space="preserve">[X] Creamos el layout activity_contratista_dashboard.xml (la pantalla principal del dashboard). </w:t>
+      </w:r>
+    </w:p>
+    <w:p>
+      <w:r>
+        <w:t xml:space="preserve">[X] Actualizamos ApiService.java con los </w:t>
+      </w:r>
+      <w:r>
+        <w:rPr>
+          <w:i/>
+          <w:iCs/>
+        </w:rPr>
+        <w:t>endpoints</w:t>
+      </w:r>
+      <w:r>
+        <w:t xml:space="preserve"> getContratistaStats y getMisProyectosContratista. </w:t>
+      </w:r>
+    </w:p>
+    <w:p>
+      <w:r>
+        <w:t xml:space="preserve">[X] Creamos los scripts PHP getContratistaStats.php (con COUNT(*)) y getMisProyectosContratista.php (con SELECT ... WHERE id_contratista = ?). </w:t>
+      </w:r>
+    </w:p>
+    <w:p>
+      <w:r>
+        <w:t xml:space="preserve">[X] Creamos el ContratistaProyectoAdapter.java. </w:t>
+      </w:r>
+    </w:p>
+    <w:p>
+      <w:r>
+        <w:t xml:space="preserve">[X] Creamos la lógica ContratistaDashboardActivity.java, que llama a ambos </w:t>
+      </w:r>
+      <w:r>
+        <w:rPr>
+          <w:i/>
+          <w:iCs/>
+        </w:rPr>
+        <w:t>endpoints</w:t>
+      </w:r>
+      <w:r>
+        <w:t xml:space="preserve"> para poblar las tarjetas de estadísticas y el RecyclerView. </w:t>
+      </w:r>
+    </w:p>
+    <w:p>
+      <w:r>
+        <w:t>[X] Declaramos ContratistaDashboardActivity en AndroidManifest.xml.</w:t>
+      </w:r>
+    </w:p>
+    <w:p>
+      <w:r>
+        <w:rPr>
+          <w:b/>
+          <w:bCs/>
+        </w:rPr>
+        <w:t>Parte 15: Ver Postulaciones por Proyecto</w:t>
+      </w:r>
+      <w:r>
+        <w:t xml:space="preserve"> </w:t>
+      </w:r>
+    </w:p>
+    <w:p>
+      <w:r>
+        <w:t xml:space="preserve">[X] Actualizamos Postulacion.java para que pueda recibir un objeto PerfilEstudiante anidado (el postulante). </w:t>
+      </w:r>
+    </w:p>
+    <w:p>
+      <w:r>
+        <w:t xml:space="preserve">[X] Actualizamos ApiService.java con el </w:t>
+      </w:r>
+      <w:r>
+        <w:rPr>
+          <w:i/>
+          <w:iCs/>
+        </w:rPr>
+        <w:t>endpoint</w:t>
+      </w:r>
+      <w:r>
+        <w:t xml:space="preserve"> getPostulacionesPorProyecto(token, id_proyecto).</w:t>
+      </w:r>
+    </w:p>
+    <w:p>
+      <w:r>
+        <w:t xml:space="preserve">[X] Creamos el script getPostulacionesPorProyecto.php (que une postulaciones, usuarios, perfil_estudiante y codifica la foto_perfil a Base64). </w:t>
+      </w:r>
+    </w:p>
+    <w:p>
+      <w:r>
+        <w:t xml:space="preserve">[X] Creamos el layout item_postulante.xml (la tarjeta para cada estudiante, con su foto y oferta). </w:t>
+      </w:r>
+    </w:p>
+    <w:p>
+      <w:r>
+        <w:t xml:space="preserve">[X] Creamos el layout activity_ver_postulaciones.xml (la pantalla de la lista). </w:t>
+      </w:r>
+    </w:p>
+    <w:p>
+      <w:r>
+        <w:lastRenderedPageBreak/>
+        <w:t xml:space="preserve">[X] Creamos el PostulanteAdapter.java (con lógica de decodificación Base64). </w:t>
+      </w:r>
+    </w:p>
+    <w:p>
+      <w:r>
+        <w:t xml:space="preserve">[X] Creamos la lógica VerPostulacionesActivity.java para poblar la lista. </w:t>
+      </w:r>
+    </w:p>
+    <w:p>
+      <w:r>
+        <w:t xml:space="preserve">[X] Actualizamos ContratistaProyectoAdapter.java para que el botón "Ver Postulaciones" abra VerPostulacionesActivity. </w:t>
+      </w:r>
+    </w:p>
+    <w:p>
+      <w:r>
+        <w:t>[X] Declaramos VerPostulacionesActivity en AndroidManifest.xml.</w:t>
+      </w:r>
+    </w:p>
+    <w:p>
+      <w:r>
+        <w:rPr>
+          <w:b/>
+          <w:bCs/>
+        </w:rPr>
+        <w:t>Parte 16: Ver Perfil del Postulante y Tomar Acción</w:t>
+      </w:r>
+      <w:r>
+        <w:t xml:space="preserve"> </w:t>
+      </w:r>
+    </w:p>
+    <w:p>
+      <w:r>
+        <w:t xml:space="preserve">[X] Creamos el POJO DetallePostulante.java (que contiene PerfilEstudiante y Postulacion). </w:t>
+      </w:r>
+    </w:p>
+    <w:p>
+      <w:r>
+        <w:t xml:space="preserve">[X] Actualizamos ApiService.java con el </w:t>
+      </w:r>
+      <w:r>
+        <w:rPr>
+          <w:i/>
+          <w:iCs/>
+        </w:rPr>
+        <w:t>endpoint</w:t>
+      </w:r>
+      <w:r>
+        <w:t xml:space="preserve"> getDetallePostulante(token, id_postulacion). </w:t>
+      </w:r>
+    </w:p>
+    <w:p>
+      <w:r>
+        <w:t xml:space="preserve">[X] Creamos el script getDetallePostulante.php (que recopila perfil, habilidades, universidades con logos Base64 y detalles de la postulación). </w:t>
+      </w:r>
+    </w:p>
+    <w:p>
+      <w:r>
+        <w:t xml:space="preserve">[X] Creamos el layout activity_detalle_postulante.xml (la pantalla de perfil completa con botones de "Aceptar" y "Rechazar"). </w:t>
+      </w:r>
+    </w:p>
+    <w:p>
+      <w:r>
+        <w:t xml:space="preserve">[X] Creamos la lógica DetallePostulanteActivity.java (reutilizando HabilidadAdapter y UniversidadAdapter para poblar las listas). </w:t>
+      </w:r>
+    </w:p>
+    <w:p>
+      <w:r>
+        <w:t xml:space="preserve">[X] Actualizamos PostulanteAdapter.java para que al hacer clic en un item se abra DetallePostulanteActivity. </w:t>
+      </w:r>
+    </w:p>
+    <w:p>
+      <w:r>
+        <w:t xml:space="preserve">[X] Declaramos DetallePostulanteActivity en AndroidManifest.xml. </w:t>
+      </w:r>
+    </w:p>
+    <w:p>
+      <w:r>
+        <w:t xml:space="preserve">[X] </w:t>
+      </w:r>
+      <w:r>
+        <w:rPr>
+          <w:b/>
+          <w:bCs/>
+        </w:rPr>
+        <w:t>Lógica de Aceptar/Rechazar:</w:t>
+      </w:r>
+      <w:r>
+        <w:t xml:space="preserve"> </w:t>
+      </w:r>
+    </w:p>
+    <w:p>
+      <w:r>
+        <w:t xml:space="preserve">[X] Creamos el script actualizarEstadoPostulacion.php (con transacciones para actualizar postulaciones.estado, proyectos.estado y rechazar otras postulaciones). </w:t>
+      </w:r>
+    </w:p>
+    <w:p>
+      <w:r>
+        <w:t xml:space="preserve">[X] Actualizamos ApiService.java con el </w:t>
+      </w:r>
+      <w:r>
+        <w:rPr>
+          <w:i/>
+          <w:iCs/>
+        </w:rPr>
+        <w:t>endpoint</w:t>
+      </w:r>
+      <w:r>
+        <w:t xml:space="preserve"> actualizarEstadoPostulacion. </w:t>
+      </w:r>
+    </w:p>
+    <w:p>
+      <w:r>
+        <w:t xml:space="preserve">[X] Implementamos los </w:t>
+      </w:r>
+      <w:r>
+        <w:rPr>
+          <w:i/>
+          <w:iCs/>
+        </w:rPr>
+        <w:t>listeners</w:t>
+      </w:r>
+      <w:r>
+        <w:t xml:space="preserve"> de btnAceptar y btnRechazar en DetallePostulanteActivity.java para llamar al </w:t>
+      </w:r>
+      <w:r>
+        <w:rPr>
+          <w:i/>
+          <w:iCs/>
+        </w:rPr>
+        <w:t>endpoint</w:t>
+      </w:r>
+      <w:r>
+        <w:t xml:space="preserve"> y cerrar la pantalla.</w:t>
+      </w:r>
+    </w:p>
+    <w:p>
+      <w:r>
+        <w:rPr>
+          <w:b/>
+          <w:bCs/>
+        </w:rPr>
+        <w:t>Parte 17: Publicar Nuevo Proyecto</w:t>
+      </w:r>
+      <w:r>
+        <w:t xml:space="preserve"> </w:t>
+      </w:r>
+    </w:p>
+    <w:p>
+      <w:r>
+        <w:t xml:space="preserve">[X] Actualizamos Proyecto.java para incluir idContratista e idCategoria para el envío de datos. </w:t>
+      </w:r>
+    </w:p>
+    <w:p>
+      <w:r>
+        <w:t xml:space="preserve">[X] Creamos el layout activity_publicar_proyecto.xml (el formulario). </w:t>
+      </w:r>
+    </w:p>
+    <w:p>
+      <w:r>
+        <w:lastRenderedPageBreak/>
+        <w:t xml:space="preserve">[X] Actualizamos ApiService.java con los </w:t>
+      </w:r>
+      <w:r>
+        <w:rPr>
+          <w:i/>
+          <w:iCs/>
+        </w:rPr>
+        <w:t>endpoints</w:t>
+      </w:r>
+      <w:r>
+        <w:t xml:space="preserve"> getCategorias y publicarProyecto. </w:t>
+      </w:r>
+    </w:p>
+    <w:p>
+      <w:r>
+        <w:t xml:space="preserve">[X] Creamos los scripts getCategorias.php y publicarProyecto.php (para INSERT en la tabla proyectos). </w:t>
+      </w:r>
+    </w:p>
+    <w:p>
+      <w:r>
+        <w:t xml:space="preserve">[X] Creamos la lógica PublicarProyectoActivity.java (cargando categorías en el </w:t>
+      </w:r>
+      <w:r>
+        <w:rPr>
+          <w:i/>
+          <w:iCs/>
+        </w:rPr>
+        <w:t>spinner</w:t>
+      </w:r>
+      <w:r>
+        <w:t xml:space="preserve"> y enviando el formulario). </w:t>
+      </w:r>
+    </w:p>
+    <w:p>
+      <w:r>
+        <w:t xml:space="preserve">[X] Declaramos PublicarProyectoActivity en AndroidManifest.xml. </w:t>
+      </w:r>
+    </w:p>
+    <w:p>
+      <w:r>
+        <w:t xml:space="preserve">[X] Actualizamos ContratistaDashboardActivity.java para que el FloatingActionButton abra el formulario. </w:t>
+      </w:r>
+    </w:p>
+    <w:p>
+      <w:r>
+        <w:t xml:space="preserve">[X] Corregimos el </w:t>
+      </w:r>
+      <w:r>
+        <w:rPr>
+          <w:i/>
+          <w:iCs/>
+        </w:rPr>
+        <w:t>bug</w:t>
+      </w:r>
+      <w:r>
+        <w:t xml:space="preserve"> de fecha_limite en publicarProyecto.php para que inserte NULL en lugar de 0000-00-00. </w:t>
+      </w:r>
+    </w:p>
+    <w:p>
+      <w:r>
+        <w:t xml:space="preserve">[X] </w:t>
+      </w:r>
+      <w:r>
+        <w:rPr>
+          <w:b/>
+          <w:bCs/>
+        </w:rPr>
+        <w:t>Éxito:</w:t>
+      </w:r>
+      <w:r>
+        <w:t xml:space="preserve"> El proyecto se publica correctamente.</w:t>
+      </w:r>
+    </w:p>
+    <w:p/>
+    <w:p/>
+    <w:p/>
+    <w:p/>
+    <w:p/>
+    <w:p>
+      <w:pPr>
+        <w:rPr>
+          <w:u w:val="single"/>
+        </w:rPr>
+      </w:pPr>
+      <w:r>
         <w:pict w14:anchorId="53C4D937">
           <v:rect id="_x0000_i1025" style="width:0;height:1.5pt" o:hralign="center" o:hrstd="t" o:hr="t" fillcolor="#a0a0a0" stroked="f"/>
         </w:pict>
-      </w:r>
-    </w:p>
-    <w:p>
-      <w:r>
-        <w:t xml:space="preserve">¡Excelente! Con esto, el </w:t>
-      </w:r>
-      <w:r>
-        <w:rPr>
-          <w:b/>
-          <w:bCs/>
-        </w:rPr>
-        <w:t>flujo completo del Estudiante</w:t>
-      </w:r>
-      <w:r>
-        <w:t xml:space="preserve"> está terminado. Ahora puede registrarse, ver proyectos, postularse, ver su perfil, editar su perfil y ver su historial de postulaciones. Cuando estés listo, dime "sigue" para pasar a la </w:t>
-      </w:r>
-      <w:r>
-        <w:rPr>
-          <w:b/>
-          <w:bCs/>
-        </w:rPr>
-        <w:t>Parte 12</w:t>
-      </w:r>
-      <w:r>
-        <w:t xml:space="preserve"> (el flujo del Contratista).</w:t>
       </w:r>
     </w:p>
     <w:p>
@@ -3540,6 +4397,119 @@
     </w:lvl>
   </w:abstractNum>
   <w:abstractNum w:abstractNumId="12" w15:restartNumberingAfterBreak="0">
+    <w:nsid w:val="52095FB5"/>
+    <w:multiLevelType w:val="hybridMultilevel"/>
+    <w:tmpl w:val="BE3ED5C8"/>
+    <w:lvl w:ilvl="0" w:tplc="440A0001">
+      <w:start w:val="1"/>
+      <w:numFmt w:val="bullet"/>
+      <w:lvlText w:val=""/>
+      <w:lvlJc w:val="left"/>
+      <w:pPr>
+        <w:ind w:left="720" w:hanging="360"/>
+      </w:pPr>
+      <w:rPr>
+        <w:rFonts w:ascii="Symbol" w:hAnsi="Symbol" w:hint="default"/>
+      </w:rPr>
+    </w:lvl>
+    <w:lvl w:ilvl="1" w:tplc="440A0003" w:tentative="1">
+      <w:start w:val="1"/>
+      <w:numFmt w:val="bullet"/>
+      <w:lvlText w:val="o"/>
+      <w:lvlJc w:val="left"/>
+      <w:pPr>
+        <w:ind w:left="1440" w:hanging="360"/>
+      </w:pPr>
+      <w:rPr>
+        <w:rFonts w:ascii="Courier New" w:hAnsi="Courier New" w:cs="Courier New" w:hint="default"/>
+      </w:rPr>
+    </w:lvl>
+    <w:lvl w:ilvl="2" w:tplc="440A0005" w:tentative="1">
+      <w:start w:val="1"/>
+      <w:numFmt w:val="bullet"/>
+      <w:lvlText w:val=""/>
+      <w:lvlJc w:val="left"/>
+      <w:pPr>
+        <w:ind w:left="2160" w:hanging="360"/>
+      </w:pPr>
+      <w:rPr>
+        <w:rFonts w:ascii="Wingdings" w:hAnsi="Wingdings" w:hint="default"/>
+      </w:rPr>
+    </w:lvl>
+    <w:lvl w:ilvl="3" w:tplc="440A0001" w:tentative="1">
+      <w:start w:val="1"/>
+      <w:numFmt w:val="bullet"/>
+      <w:lvlText w:val=""/>
+      <w:lvlJc w:val="left"/>
+      <w:pPr>
+        <w:ind w:left="2880" w:hanging="360"/>
+      </w:pPr>
+      <w:rPr>
+        <w:rFonts w:ascii="Symbol" w:hAnsi="Symbol" w:hint="default"/>
+      </w:rPr>
+    </w:lvl>
+    <w:lvl w:ilvl="4" w:tplc="440A0003" w:tentative="1">
+      <w:start w:val="1"/>
+      <w:numFmt w:val="bullet"/>
+      <w:lvlText w:val="o"/>
+      <w:lvlJc w:val="left"/>
+      <w:pPr>
+        <w:ind w:left="3600" w:hanging="360"/>
+      </w:pPr>
+      <w:rPr>
+        <w:rFonts w:ascii="Courier New" w:hAnsi="Courier New" w:cs="Courier New" w:hint="default"/>
+      </w:rPr>
+    </w:lvl>
+    <w:lvl w:ilvl="5" w:tplc="440A0005" w:tentative="1">
+      <w:start w:val="1"/>
+      <w:numFmt w:val="bullet"/>
+      <w:lvlText w:val=""/>
+      <w:lvlJc w:val="left"/>
+      <w:pPr>
+        <w:ind w:left="4320" w:hanging="360"/>
+      </w:pPr>
+      <w:rPr>
+        <w:rFonts w:ascii="Wingdings" w:hAnsi="Wingdings" w:hint="default"/>
+      </w:rPr>
+    </w:lvl>
+    <w:lvl w:ilvl="6" w:tplc="440A0001" w:tentative="1">
+      <w:start w:val="1"/>
+      <w:numFmt w:val="bullet"/>
+      <w:lvlText w:val=""/>
+      <w:lvlJc w:val="left"/>
+      <w:pPr>
+        <w:ind w:left="5040" w:hanging="360"/>
+      </w:pPr>
+      <w:rPr>
+        <w:rFonts w:ascii="Symbol" w:hAnsi="Symbol" w:hint="default"/>
+      </w:rPr>
+    </w:lvl>
+    <w:lvl w:ilvl="7" w:tplc="440A0003" w:tentative="1">
+      <w:start w:val="1"/>
+      <w:numFmt w:val="bullet"/>
+      <w:lvlText w:val="o"/>
+      <w:lvlJc w:val="left"/>
+      <w:pPr>
+        <w:ind w:left="5760" w:hanging="360"/>
+      </w:pPr>
+      <w:rPr>
+        <w:rFonts w:ascii="Courier New" w:hAnsi="Courier New" w:cs="Courier New" w:hint="default"/>
+      </w:rPr>
+    </w:lvl>
+    <w:lvl w:ilvl="8" w:tplc="440A0005" w:tentative="1">
+      <w:start w:val="1"/>
+      <w:numFmt w:val="bullet"/>
+      <w:lvlText w:val=""/>
+      <w:lvlJc w:val="left"/>
+      <w:pPr>
+        <w:ind w:left="6480" w:hanging="360"/>
+      </w:pPr>
+      <w:rPr>
+        <w:rFonts w:ascii="Wingdings" w:hAnsi="Wingdings" w:hint="default"/>
+      </w:rPr>
+    </w:lvl>
+  </w:abstractNum>
+  <w:abstractNum w:abstractNumId="13" w15:restartNumberingAfterBreak="0">
     <w:nsid w:val="605273DB"/>
     <w:multiLevelType w:val="multilevel"/>
     <w:tmpl w:val="EE9EE85C"/>
@@ -3688,7 +4658,120 @@
       </w:rPr>
     </w:lvl>
   </w:abstractNum>
-  <w:abstractNum w:abstractNumId="13" w15:restartNumberingAfterBreak="0">
+  <w:abstractNum w:abstractNumId="14" w15:restartNumberingAfterBreak="0">
+    <w:nsid w:val="630C1E2B"/>
+    <w:multiLevelType w:val="hybridMultilevel"/>
+    <w:tmpl w:val="1BD078EC"/>
+    <w:lvl w:ilvl="0" w:tplc="440A0001">
+      <w:start w:val="1"/>
+      <w:numFmt w:val="bullet"/>
+      <w:lvlText w:val=""/>
+      <w:lvlJc w:val="left"/>
+      <w:pPr>
+        <w:ind w:left="720" w:hanging="360"/>
+      </w:pPr>
+      <w:rPr>
+        <w:rFonts w:ascii="Symbol" w:hAnsi="Symbol" w:hint="default"/>
+      </w:rPr>
+    </w:lvl>
+    <w:lvl w:ilvl="1" w:tplc="440A0003" w:tentative="1">
+      <w:start w:val="1"/>
+      <w:numFmt w:val="bullet"/>
+      <w:lvlText w:val="o"/>
+      <w:lvlJc w:val="left"/>
+      <w:pPr>
+        <w:ind w:left="1440" w:hanging="360"/>
+      </w:pPr>
+      <w:rPr>
+        <w:rFonts w:ascii="Courier New" w:hAnsi="Courier New" w:cs="Courier New" w:hint="default"/>
+      </w:rPr>
+    </w:lvl>
+    <w:lvl w:ilvl="2" w:tplc="440A0005" w:tentative="1">
+      <w:start w:val="1"/>
+      <w:numFmt w:val="bullet"/>
+      <w:lvlText w:val=""/>
+      <w:lvlJc w:val="left"/>
+      <w:pPr>
+        <w:ind w:left="2160" w:hanging="360"/>
+      </w:pPr>
+      <w:rPr>
+        <w:rFonts w:ascii="Wingdings" w:hAnsi="Wingdings" w:hint="default"/>
+      </w:rPr>
+    </w:lvl>
+    <w:lvl w:ilvl="3" w:tplc="440A0001" w:tentative="1">
+      <w:start w:val="1"/>
+      <w:numFmt w:val="bullet"/>
+      <w:lvlText w:val=""/>
+      <w:lvlJc w:val="left"/>
+      <w:pPr>
+        <w:ind w:left="2880" w:hanging="360"/>
+      </w:pPr>
+      <w:rPr>
+        <w:rFonts w:ascii="Symbol" w:hAnsi="Symbol" w:hint="default"/>
+      </w:rPr>
+    </w:lvl>
+    <w:lvl w:ilvl="4" w:tplc="440A0003" w:tentative="1">
+      <w:start w:val="1"/>
+      <w:numFmt w:val="bullet"/>
+      <w:lvlText w:val="o"/>
+      <w:lvlJc w:val="left"/>
+      <w:pPr>
+        <w:ind w:left="3600" w:hanging="360"/>
+      </w:pPr>
+      <w:rPr>
+        <w:rFonts w:ascii="Courier New" w:hAnsi="Courier New" w:cs="Courier New" w:hint="default"/>
+      </w:rPr>
+    </w:lvl>
+    <w:lvl w:ilvl="5" w:tplc="440A0005" w:tentative="1">
+      <w:start w:val="1"/>
+      <w:numFmt w:val="bullet"/>
+      <w:lvlText w:val=""/>
+      <w:lvlJc w:val="left"/>
+      <w:pPr>
+        <w:ind w:left="4320" w:hanging="360"/>
+      </w:pPr>
+      <w:rPr>
+        <w:rFonts w:ascii="Wingdings" w:hAnsi="Wingdings" w:hint="default"/>
+      </w:rPr>
+    </w:lvl>
+    <w:lvl w:ilvl="6" w:tplc="440A0001" w:tentative="1">
+      <w:start w:val="1"/>
+      <w:numFmt w:val="bullet"/>
+      <w:lvlText w:val=""/>
+      <w:lvlJc w:val="left"/>
+      <w:pPr>
+        <w:ind w:left="5040" w:hanging="360"/>
+      </w:pPr>
+      <w:rPr>
+        <w:rFonts w:ascii="Symbol" w:hAnsi="Symbol" w:hint="default"/>
+      </w:rPr>
+    </w:lvl>
+    <w:lvl w:ilvl="7" w:tplc="440A0003" w:tentative="1">
+      <w:start w:val="1"/>
+      <w:numFmt w:val="bullet"/>
+      <w:lvlText w:val="o"/>
+      <w:lvlJc w:val="left"/>
+      <w:pPr>
+        <w:ind w:left="5760" w:hanging="360"/>
+      </w:pPr>
+      <w:rPr>
+        <w:rFonts w:ascii="Courier New" w:hAnsi="Courier New" w:cs="Courier New" w:hint="default"/>
+      </w:rPr>
+    </w:lvl>
+    <w:lvl w:ilvl="8" w:tplc="440A0005" w:tentative="1">
+      <w:start w:val="1"/>
+      <w:numFmt w:val="bullet"/>
+      <w:lvlText w:val=""/>
+      <w:lvlJc w:val="left"/>
+      <w:pPr>
+        <w:ind w:left="6480" w:hanging="360"/>
+      </w:pPr>
+      <w:rPr>
+        <w:rFonts w:ascii="Wingdings" w:hAnsi="Wingdings" w:hint="default"/>
+      </w:rPr>
+    </w:lvl>
+  </w:abstractNum>
+  <w:abstractNum w:abstractNumId="15" w15:restartNumberingAfterBreak="0">
     <w:nsid w:val="6B951066"/>
     <w:multiLevelType w:val="multilevel"/>
     <w:tmpl w:val="8232616A"/>
@@ -3837,7 +4920,7 @@
       </w:rPr>
     </w:lvl>
   </w:abstractNum>
-  <w:abstractNum w:abstractNumId="14" w15:restartNumberingAfterBreak="0">
+  <w:abstractNum w:abstractNumId="16" w15:restartNumberingAfterBreak="0">
     <w:nsid w:val="724476A0"/>
     <w:multiLevelType w:val="multilevel"/>
     <w:tmpl w:val="31AE67F6"/>
@@ -3986,7 +5069,7 @@
       </w:rPr>
     </w:lvl>
   </w:abstractNum>
-  <w:abstractNum w:abstractNumId="15" w15:restartNumberingAfterBreak="0">
+  <w:abstractNum w:abstractNumId="17" w15:restartNumberingAfterBreak="0">
     <w:nsid w:val="79F16FDD"/>
     <w:multiLevelType w:val="multilevel"/>
     <w:tmpl w:val="7FE03F74"/>
@@ -4142,16 +5225,16 @@
     <w:abstractNumId w:val="1"/>
   </w:num>
   <w:num w:numId="3" w16cid:durableId="1433748183">
-    <w:abstractNumId w:val="13"/>
+    <w:abstractNumId w:val="15"/>
   </w:num>
   <w:num w:numId="4" w16cid:durableId="1229072388">
-    <w:abstractNumId w:val="15"/>
+    <w:abstractNumId w:val="17"/>
   </w:num>
   <w:num w:numId="5" w16cid:durableId="1996295867">
     <w:abstractNumId w:val="11"/>
   </w:num>
   <w:num w:numId="6" w16cid:durableId="1677610832">
-    <w:abstractNumId w:val="12"/>
+    <w:abstractNumId w:val="13"/>
   </w:num>
   <w:num w:numId="7" w16cid:durableId="984159764">
     <w:abstractNumId w:val="2"/>
@@ -4166,7 +5249,7 @@
     <w:abstractNumId w:val="9"/>
   </w:num>
   <w:num w:numId="11" w16cid:durableId="1691254675">
-    <w:abstractNumId w:val="14"/>
+    <w:abstractNumId w:val="16"/>
   </w:num>
   <w:num w:numId="12" w16cid:durableId="17898657">
     <w:abstractNumId w:val="0"/>
@@ -4182,6 +5265,12 @@
   </w:num>
   <w:num w:numId="16" w16cid:durableId="1188762301">
     <w:abstractNumId w:val="4"/>
+  </w:num>
+  <w:num w:numId="17" w16cid:durableId="1567033229">
+    <w:abstractNumId w:val="12"/>
+  </w:num>
+  <w:num w:numId="18" w16cid:durableId="170417163">
+    <w:abstractNumId w:val="14"/>
   </w:num>
 </w:numbering>
 </file>
@@ -4789,6 +5878,7 @@
   <w:style w:type="character" w:default="1" w:styleId="Fuentedeprrafopredeter">
     <w:name w:val="Default Paragraph Font"/>
     <w:uiPriority w:val="1"/>
+    <w:semiHidden/>
     <w:unhideWhenUsed/>
   </w:style>
   <w:style w:type="table" w:default="1" w:styleId="Tablanormal">

</xml_diff>